<commit_message>
feat: gerar PDF compativel com SharePoint via Edge headless
Adiciona checkbox "Gerar PDF tambem (para upload no SharePoint)" na GUI
e parametro -Pdf no executar.ps1. O PDF e gerado a partir do HTML usando
Microsoft Edge ou Google Chrome em modo headless, com o Gantt do Mermaid
ja renderizado dentro do arquivo.

Por que PDF? O SharePoint corporativo forca download de .html em muitos
tenants e bloqueia scripts externos via CSP. Com PDF, o preview nativo
funciona direto na biblioteca de documentos.

Mudancas:
- executar.ps1: novo switch -Pdf, funcoes Find-EdgeOrChrome e
  Convert-HtmlToPdf (rota pelo TEMP para evitar problemas de path com
  espacos no OneDrive)
- gui.ps1: nova checkbox, form cresceu de 320 para 345 de altura,
  controles deslocados, abre PDF em vez de HTML quando marcado
- docs/MANUAL.docx: secao 5 dedicada ao fluxo SharePoint
- docs/capture-screenshot.ps1 e docs/screenshot.png: atualizados para
  refletir o novo layout
</commit_message>
<xml_diff>
--- a/docs/MANUAL.docx
+++ b/docs/MANUAL.docx
@@ -2,7 +2,7 @@
 <file path=word/document.xml><?xml version="1.0" encoding="utf-8"?>
 <w:document xmlns:w="http://schemas.openxmlformats.org/wordprocessingml/2006/main" xmlns:m="http://schemas.openxmlformats.org/officeDocument/2006/math" xmlns:r="http://schemas.openxmlformats.org/officeDocument/2006/relationships" xmlns:o="urn:schemas-microsoft-com:office:office" xmlns:v="urn:schemas-microsoft-com:vml" xmlns:w10="urn:schemas-microsoft-com:office:word" xmlns:a="http://schemas.openxmlformats.org/drawingml/2006/main" xmlns:pic="http://schemas.openxmlformats.org/drawingml/2006/picture" xmlns:wp="http://schemas.openxmlformats.org/drawingml/2006/wordprocessingDrawing">
   <w:body>
-    <w:bookmarkStart w:id="38" w:name="Xdc1b0064654453531819115c4c8d1d5e6d5d731"/>
+    <w:bookmarkStart w:id="42" w:name="Xdc1b0064654453531819115c4c8d1d5e6d5d731"/>
     <w:p>
       <w:pPr>
         <w:pStyle w:val="Heading1"/>
@@ -16,7 +16,7 @@
         <w:pStyle w:val="FirstParagraph"/>
       </w:pPr>
       <w:r>
-        <w:t xml:space="preserve">Este manual descreve o fluxo completo, do download ate gerar o relatorio HTML.</w:t>
+        <w:t xml:space="preserve">Este manual descreve o fluxo completo, do download ate gerar o relatorio.</w:t>
       </w:r>
       <w:r>
         <w:t xml:space="preserve"> </w:t>
@@ -245,7 +245,7 @@
         <w:rPr>
           <w:rStyle w:val="VerbatimChar"/>
         </w:rPr>
-        <w:t xml:space="preserve">README.md</w:t>
+        <w:t xml:space="preserve">LICENSE</w:t>
       </w:r>
       <w:r>
         <w:br/>
@@ -254,7 +254,7 @@
         <w:rPr>
           <w:rStyle w:val="VerbatimChar"/>
         </w:rPr>
-        <w:t xml:space="preserve">LICENSE</w:t>
+        <w:t xml:space="preserve">template.md            &lt;- nao precisa abrir</w:t>
       </w:r>
       <w:r>
         <w:br/>
@@ -263,7 +263,7 @@
         <w:rPr>
           <w:rStyle w:val="VerbatimChar"/>
         </w:rPr>
-        <w:t xml:space="preserve">assets/                &lt;- design e icone</w:t>
+        <w:t xml:space="preserve">assets/                &lt;- recursos visuais (icone, CSS, etc.)</w:t>
       </w:r>
       <w:r>
         <w:br/>
@@ -281,16 +281,7 @@
         <w:rPr>
           <w:rStyle w:val="VerbatimChar"/>
         </w:rPr>
-        <w:t xml:space="preserve">docs/                  &lt;- este manual e screenshots</w:t>
-      </w:r>
-      <w:r>
-        <w:br/>
-      </w:r>
-      <w:r>
-        <w:rPr>
-          <w:rStyle w:val="VerbatimChar"/>
-        </w:rPr>
-        <w:t xml:space="preserve">template.md            &lt;- nao precisa abrir</w:t>
+        <w:t xml:space="preserve">docs/                  &lt;- este manual</w:t>
       </w:r>
     </w:p>
     <w:p>
@@ -1039,7 +1030,7 @@
       <w:r>
         <w:drawing>
           <wp:inline>
-            <wp:extent cx="4812631" cy="3080084"/>
+            <wp:extent cx="4812631" cy="3320715"/>
             <wp:effectExtent b="0" l="0" r="0" t="0"/>
             <wp:docPr descr="Tela do gerador" title="" id="19" name="Picture"/>
             <a:graphic>
@@ -1060,7 +1051,7 @@
                   <pic:spPr bwMode="auto">
                     <a:xfrm>
                       <a:off x="0" y="0"/>
-                      <a:ext cx="4812631" cy="3080084"/>
+                      <a:ext cx="4812631" cy="3320715"/>
                     </a:xfrm>
                     <a:prstGeom prst="rect">
                       <a:avLst/>
@@ -1104,7 +1095,7 @@
           <w:b/>
           <w:bCs/>
         </w:rPr>
-        <w:t xml:space="preserve">3 controles</w:t>
+        <w:t xml:space="preserve">4 controles</w:t>
       </w:r>
       <w:r>
         <w:t xml:space="preserve">:</w:t>
@@ -1201,7 +1192,7 @@
           <w:b/>
           <w:bCs/>
         </w:rPr>
-        <w:t xml:space="preserve">Abrir HTML apos gerar</w:t>
+        <w:t xml:space="preserve">Abrir apos gerar</w:t>
       </w:r>
       <w:r>
         <w:t xml:space="preserve"> </w:t>
@@ -1214,6 +1205,67 @@
       </w:r>
       <w:r>
         <w:t xml:space="preserve">com o relatorio quando termina. Sugestao: deixar marcado.</w:t>
+      </w:r>
+    </w:p>
+    <w:p>
+      <w:pPr>
+        <w:pStyle w:val="Compact"/>
+        <w:numPr>
+          <w:ilvl w:val="1"/>
+          <w:numId w:val="1004"/>
+        </w:numPr>
+      </w:pPr>
+      <w:r>
+        <w:t xml:space="preserve">Se a opcao</w:t>
+      </w:r>
+      <w:r>
+        <w:t xml:space="preserve"> </w:t>
+      </w:r>
+      <w:r>
+        <w:rPr>
+          <w:b/>
+          <w:bCs/>
+        </w:rPr>
+        <w:t xml:space="preserve">Gerar PDF</w:t>
+      </w:r>
+      <w:r>
+        <w:t xml:space="preserve"> </w:t>
+      </w:r>
+      <w:r>
+        <w:t xml:space="preserve">estiver marcada, abre o PDF em vez do HTML.</w:t>
+      </w:r>
+    </w:p>
+    <w:p>
+      <w:pPr>
+        <w:numPr>
+          <w:ilvl w:val="0"/>
+          <w:numId w:val="1003"/>
+        </w:numPr>
+      </w:pPr>
+      <w:r>
+        <w:rPr>
+          <w:b/>
+          <w:bCs/>
+        </w:rPr>
+        <w:t xml:space="preserve">Gerar PDF tambem (para upload no SharePoint)</w:t>
+      </w:r>
+      <w:r>
+        <w:t xml:space="preserve"> </w:t>
+      </w:r>
+      <w:r>
+        <w:t xml:space="preserve">- quando marcado,</w:t>
+      </w:r>
+      <w:r>
+        <w:t xml:space="preserve"> </w:t>
+      </w:r>
+      <w:r>
+        <w:t xml:space="preserve">alem do HTML, gera tambem um arquivo PDF compativel com SharePoint</w:t>
+      </w:r>
+      <w:r>
+        <w:t xml:space="preserve"> </w:t>
+      </w:r>
+      <w:r>
+        <w:t xml:space="preserve">(mais detalhes na secao 5).</w:t>
       </w:r>
     </w:p>
     <w:bookmarkEnd w:id="22"/>
@@ -1224,176 +1276,6 @@
       </w:pPr>
       <w:r>
         <w:t xml:space="preserve">3.3 Clicar em "Gerar Relatorio"</w:t>
-      </w:r>
-    </w:p>
-    <w:p>
-      <w:pPr>
-        <w:pStyle w:val="Compact"/>
-        <w:numPr>
-          <w:ilvl w:val="0"/>
-          <w:numId w:val="1004"/>
-        </w:numPr>
-      </w:pPr>
-      <w:r>
-        <w:t xml:space="preserve">O cursor vira</w:t>
-      </w:r>
-      <w:r>
-        <w:t xml:space="preserve"> </w:t>
-      </w:r>
-      <w:r>
-        <w:rPr>
-          <w:b/>
-          <w:bCs/>
-        </w:rPr>
-        <w:t xml:space="preserve">ampulheta</w:t>
-      </w:r>
-    </w:p>
-    <w:p>
-      <w:pPr>
-        <w:pStyle w:val="Compact"/>
-        <w:numPr>
-          <w:ilvl w:val="0"/>
-          <w:numId w:val="1004"/>
-        </w:numPr>
-      </w:pPr>
-      <w:r>
-        <w:t xml:space="preserve">Aparece uma</w:t>
-      </w:r>
-      <w:r>
-        <w:t xml:space="preserve"> </w:t>
-      </w:r>
-      <w:r>
-        <w:rPr>
-          <w:b/>
-          <w:bCs/>
-        </w:rPr>
-        <w:t xml:space="preserve">barra de progresso</w:t>
-      </w:r>
-      <w:r>
-        <w:t xml:space="preserve"> </w:t>
-      </w:r>
-      <w:r>
-        <w:t xml:space="preserve">azul animada</w:t>
-      </w:r>
-    </w:p>
-    <w:p>
-      <w:pPr>
-        <w:pStyle w:val="Compact"/>
-        <w:numPr>
-          <w:ilvl w:val="0"/>
-          <w:numId w:val="1004"/>
-        </w:numPr>
-      </w:pPr>
-      <w:r>
-        <w:t xml:space="preserve">O texto muda para</w:t>
-      </w:r>
-      <w:r>
-        <w:t xml:space="preserve"> </w:t>
-      </w:r>
-      <w:r>
-        <w:rPr>
-          <w:i/>
-          <w:iCs/>
-        </w:rPr>
-        <w:t xml:space="preserve">"Gerando relatorio... Aguarde..."</w:t>
-      </w:r>
-    </w:p>
-    <w:p>
-      <w:pPr>
-        <w:pStyle w:val="FirstParagraph"/>
-      </w:pPr>
-      <w:r>
-        <w:t xml:space="preserve">Pode levar de</w:t>
-      </w:r>
-      <w:r>
-        <w:t xml:space="preserve"> </w:t>
-      </w:r>
-      <w:r>
-        <w:rPr>
-          <w:b/>
-          <w:bCs/>
-        </w:rPr>
-        <w:t xml:space="preserve">5 segundos</w:t>
-      </w:r>
-      <w:r>
-        <w:t xml:space="preserve"> </w:t>
-      </w:r>
-      <w:r>
-        <w:t xml:space="preserve">(planilha pequena, Pandoc ja instalado) a</w:t>
-      </w:r>
-      <w:r>
-        <w:t xml:space="preserve"> </w:t>
-      </w:r>
-      <w:r>
-        <w:rPr>
-          <w:b/>
-          <w:bCs/>
-        </w:rPr>
-        <w:t xml:space="preserve">2 minutos</w:t>
-      </w:r>
-      <w:r>
-        <w:t xml:space="preserve"> </w:t>
-      </w:r>
-      <w:r>
-        <w:t xml:space="preserve">(primeira execucao, instalando Pandoc).</w:t>
-      </w:r>
-    </w:p>
-    <w:p>
-      <w:pPr>
-        <w:pStyle w:val="BlockText"/>
-      </w:pPr>
-      <w:r>
-        <w:t xml:space="preserve">Atalhos:</w:t>
-      </w:r>
-      <w:r>
-        <w:t xml:space="preserve"> </w:t>
-      </w:r>
-      <w:r>
-        <w:rPr>
-          <w:b/>
-          <w:bCs/>
-        </w:rPr>
-        <w:t xml:space="preserve">Enter</w:t>
-      </w:r>
-      <w:r>
-        <w:t xml:space="preserve"> </w:t>
-      </w:r>
-      <w:r>
-        <w:t xml:space="preserve">= Gerar,</w:t>
-      </w:r>
-      <w:r>
-        <w:t xml:space="preserve"> </w:t>
-      </w:r>
-      <w:r>
-        <w:rPr>
-          <w:b/>
-          <w:bCs/>
-        </w:rPr>
-        <w:t xml:space="preserve">Esc</w:t>
-      </w:r>
-      <w:r>
-        <w:t xml:space="preserve"> </w:t>
-      </w:r>
-      <w:r>
-        <w:t xml:space="preserve">= Fechar.</w:t>
-      </w:r>
-    </w:p>
-    <w:bookmarkEnd w:id="23"/>
-    <w:bookmarkStart w:id="24" w:name="Xc95bed303459c01c5f00602b179f4884850da0c"/>
-    <w:p>
-      <w:pPr>
-        <w:pStyle w:val="Heading3"/>
-      </w:pPr>
-      <w:r>
-        <w:t xml:space="preserve">3.4 Resultado</w:t>
-      </w:r>
-    </w:p>
-    <w:p>
-      <w:pPr>
-        <w:pStyle w:val="FirstParagraph"/>
-      </w:pPr>
-      <w:r>
-        <w:t xml:space="preserve">Quando termina:</w:t>
       </w:r>
     </w:p>
     <w:p>
@@ -1405,17 +1287,17 @@
         </w:numPr>
       </w:pPr>
       <w:r>
-        <w:t xml:space="preserve">O texto fica verde:</w:t>
-      </w:r>
-      <w:r>
-        <w:t xml:space="preserve"> </w:t>
-      </w:r>
-      <w:r>
-        <w:rPr>
-          <w:i/>
-          <w:iCs/>
-        </w:rPr>
-        <w:t xml:space="preserve">"Sucesso! Arquivo gerado: Ferias-yyyyMMdd-HHmmss.html"</w:t>
+        <w:t xml:space="preserve">O cursor vira</w:t>
+      </w:r>
+      <w:r>
+        <w:t xml:space="preserve"> </w:t>
+      </w:r>
+      <w:r>
+        <w:rPr>
+          <w:b/>
+          <w:bCs/>
+        </w:rPr>
+        <w:t xml:space="preserve">ampulheta</w:t>
       </w:r>
     </w:p>
     <w:p>
@@ -1427,33 +1309,7 @@
         </w:numPr>
       </w:pPr>
       <w:r>
-        <w:t xml:space="preserve">Se a checkbox estava marcada, o HTML abre no navegador padrao</w:t>
-      </w:r>
-    </w:p>
-    <w:p>
-      <w:r>
-        <w:pict>
-          <v:rect style="width:0;height:1.5pt" o:hralign="center" o:hrstd="t" o:hr="t"/>
-        </w:pict>
-      </w:r>
-    </w:p>
-    <w:bookmarkEnd w:id="24"/>
-    <w:bookmarkEnd w:id="25"/>
-    <w:bookmarkStart w:id="26" w:name="X633c7a42b2fe74a3e3cea1265264fc10af5da22"/>
-    <w:p>
-      <w:pPr>
-        <w:pStyle w:val="Heading2"/>
-      </w:pPr>
-      <w:r>
-        <w:t xml:space="preserve">4. Onde estao os arquivos gerados</w:t>
-      </w:r>
-    </w:p>
-    <w:p>
-      <w:pPr>
-        <w:pStyle w:val="FirstParagraph"/>
-      </w:pPr>
-      <w:r>
-        <w:t xml:space="preserve">Cada execucao cria</w:t>
+        <w:t xml:space="preserve">Aparece uma</w:t>
       </w:r>
       <w:r>
         <w:t xml:space="preserve"> </w:t>
@@ -1463,54 +1319,13 @@
           <w:b/>
           <w:bCs/>
         </w:rPr>
-        <w:t xml:space="preserve">2 arquivos</w:t>
-      </w:r>
-      <w:r>
-        <w:t xml:space="preserve"> </w:t>
-      </w:r>
-      <w:r>
-        <w:t xml:space="preserve">com timestamp na pasta</w:t>
-      </w:r>
-      <w:r>
-        <w:t xml:space="preserve"> </w:t>
-      </w:r>
-      <w:r>
-        <w:rPr>
-          <w:rStyle w:val="VerbatimChar"/>
-        </w:rPr>
-        <w:t xml:space="preserve">results\</w:t>
-      </w:r>
-      <w:r>
-        <w:t xml:space="preserve">:</w:t>
-      </w:r>
-    </w:p>
-    <w:p>
-      <w:pPr>
-        <w:pStyle w:val="SourceCode"/>
-      </w:pPr>
-      <w:r>
-        <w:rPr>
-          <w:rStyle w:val="VerbatimChar"/>
-        </w:rPr>
-        <w:t xml:space="preserve">results\</w:t>
-      </w:r>
-      <w:r>
-        <w:br/>
-      </w:r>
-      <w:r>
-        <w:rPr>
-          <w:rStyle w:val="VerbatimChar"/>
-        </w:rPr>
-        <w:t xml:space="preserve">  Ferias-20260425-143012.md     &lt;- versao Markdown (texto puro)</w:t>
-      </w:r>
-      <w:r>
-        <w:br/>
-      </w:r>
-      <w:r>
-        <w:rPr>
-          <w:rStyle w:val="VerbatimChar"/>
-        </w:rPr>
-        <w:t xml:space="preserve">  Ferias-20260425-143012.html   &lt;- versao HTML formatada (para enviar/imprimir)</w:t>
+        <w:t xml:space="preserve">barra de progresso</w:t>
+      </w:r>
+      <w:r>
+        <w:t xml:space="preserve"> </w:t>
+      </w:r>
+      <w:r>
+        <w:t xml:space="preserve">azul animada</w:t>
       </w:r>
     </w:p>
     <w:p>
@@ -1518,303 +1333,29 @@
         <w:pStyle w:val="Compact"/>
         <w:numPr>
           <w:ilvl w:val="0"/>
-          <w:numId w:val="1006"/>
+          <w:numId w:val="1005"/>
         </w:numPr>
       </w:pPr>
       <w:r>
-        <w:t xml:space="preserve">O</w:t>
-      </w:r>
-      <w:r>
-        <w:t xml:space="preserve"> </w:t>
-      </w:r>
-      <w:r>
-        <w:rPr>
-          <w:b/>
-          <w:bCs/>
-        </w:rPr>
-        <w:t xml:space="preserve">HTML</w:t>
-      </w:r>
-      <w:r>
-        <w:t xml:space="preserve"> </w:t>
-      </w:r>
-      <w:r>
-        <w:t xml:space="preserve">e standalone: voce pode anexar em e-mail, mandar pelo Teams,</w:t>
-      </w:r>
-      <w:r>
-        <w:t xml:space="preserve"> </w:t>
-      </w:r>
-      <w:r>
-        <w:t xml:space="preserve">abrir em qualquer maquina com navegador. CSS e imagens estao embutidos.</w:t>
-      </w:r>
-    </w:p>
-    <w:p>
-      <w:pPr>
-        <w:pStyle w:val="Compact"/>
-        <w:numPr>
-          <w:ilvl w:val="0"/>
-          <w:numId w:val="1006"/>
-        </w:numPr>
-      </w:pPr>
-      <w:r>
-        <w:t xml:space="preserve">O Gantt usa</w:t>
-      </w:r>
-      <w:r>
-        <w:t xml:space="preserve"> </w:t>
-      </w:r>
-      <w:r>
-        <w:rPr>
-          <w:b/>
-          <w:bCs/>
-        </w:rPr>
-        <w:t xml:space="preserve">Mermaid</w:t>
-      </w:r>
-      <w:r>
-        <w:t xml:space="preserve"> </w:t>
-      </w:r>
-      <w:r>
-        <w:t xml:space="preserve">via internet (CDN) - precisa estar online quando</w:t>
-      </w:r>
-      <w:r>
-        <w:t xml:space="preserve"> </w:t>
-      </w:r>
-      <w:r>
-        <w:t xml:space="preserve">voce</w:t>
-      </w:r>
-      <w:r>
-        <w:t xml:space="preserve"> </w:t>
-      </w:r>
-      <w:r>
-        <w:rPr>
-          <w:b/>
-          <w:bCs/>
-        </w:rPr>
-        <w:t xml:space="preserve">abrir</w:t>
-      </w:r>
-      <w:r>
-        <w:t xml:space="preserve"> </w:t>
-      </w:r>
-      <w:r>
-        <w:t xml:space="preserve">o HTML, mas nao quando gerar.</w:t>
-      </w:r>
-    </w:p>
-    <w:p>
-      <w:pPr>
-        <w:pStyle w:val="FirstParagraph"/>
-      </w:pPr>
-      <w:r>
-        <w:t xml:space="preserve">Como sao arquivos com timestamp,</w:t>
-      </w:r>
-      <w:r>
-        <w:t xml:space="preserve"> </w:t>
-      </w:r>
-      <w:r>
-        <w:rPr>
-          <w:b/>
-          <w:bCs/>
-        </w:rPr>
-        <w:t xml:space="preserve">nada e sobrescrito</w:t>
-      </w:r>
-      <w:r>
-        <w:t xml:space="preserve"> </w:t>
-      </w:r>
-      <w:r>
-        <w:t xml:space="preserve">- voce mantem o</w:t>
-      </w:r>
-      <w:r>
-        <w:t xml:space="preserve"> </w:t>
-      </w:r>
-      <w:r>
-        <w:t xml:space="preserve">historico de todas as versoes geradas.</w:t>
-      </w:r>
-    </w:p>
-    <w:p>
-      <w:r>
-        <w:pict>
-          <v:rect style="width:0;height:1.5pt" o:hralign="center" o:hrstd="t" o:hr="t"/>
-        </w:pict>
-      </w:r>
-    </w:p>
-    <w:bookmarkEnd w:id="26"/>
-    <w:bookmarkStart w:id="31" w:name="X485183d6e666180ad9e7bf86845fdd7da3f3fc4"/>
-    <w:p>
-      <w:pPr>
-        <w:pStyle w:val="Heading2"/>
-      </w:pPr>
-      <w:r>
-        <w:t xml:space="preserve">5. O que tem dentro do relatorio</w:t>
-      </w:r>
-    </w:p>
-    <w:p>
-      <w:pPr>
-        <w:pStyle w:val="FirstParagraph"/>
-      </w:pPr>
-      <w:r>
-        <w:t xml:space="preserve">O HTML gerado tem 4 secoes:</w:t>
-      </w:r>
-    </w:p>
-    <w:bookmarkStart w:id="27" w:name="Xd58085fcf33ffcb7c3e01182439d8405711c543"/>
-    <w:p>
-      <w:pPr>
-        <w:pStyle w:val="Heading3"/>
-      </w:pPr>
-      <w:r>
-        <w:t xml:space="preserve">5.1 Dashboard mensal</w:t>
-      </w:r>
-    </w:p>
-    <w:p>
-      <w:pPr>
-        <w:pStyle w:val="FirstParagraph"/>
-      </w:pPr>
-      <w:r>
-        <w:t xml:space="preserve">Tabela resumo: quantas pessoas estao em ferias por mes, em que squads,</w:t>
-      </w:r>
-      <w:r>
-        <w:t xml:space="preserve"> </w:t>
-      </w:r>
-      <w:r>
-        <w:t xml:space="preserve">e qual o status geral.</w:t>
-      </w:r>
-    </w:p>
-    <w:bookmarkEnd w:id="27"/>
-    <w:bookmarkStart w:id="28" w:name="Xf96bb6cb8db53b7d08e738e55c10dd9179dbc23"/>
-    <w:p>
-      <w:pPr>
-        <w:pStyle w:val="Heading3"/>
-      </w:pPr>
-      <w:r>
-        <w:t xml:space="preserve">5.2 Cronograma detalhado</w:t>
-      </w:r>
-    </w:p>
-    <w:p>
-      <w:pPr>
-        <w:pStyle w:val="FirstParagraph"/>
-      </w:pPr>
-      <w:r>
-        <w:t xml:space="preserve">Tabela com</w:t>
-      </w:r>
-      <w:r>
-        <w:t xml:space="preserve"> </w:t>
-      </w:r>
-      <w:r>
-        <w:rPr>
-          <w:b/>
-          <w:bCs/>
-        </w:rPr>
-        <w:t xml:space="preserve">uma linha por periodo de ferias</w:t>
-      </w:r>
-      <w:r>
-        <w:t xml:space="preserve"> </w:t>
-      </w:r>
-      <w:r>
-        <w:t xml:space="preserve">- quem, qual squad, datas,</w:t>
-      </w:r>
-      <w:r>
-        <w:t xml:space="preserve"> </w:t>
-      </w:r>
-      <w:r>
-        <w:t xml:space="preserve">quantidade de dias, status.</w:t>
-      </w:r>
-    </w:p>
-    <w:bookmarkEnd w:id="28"/>
-    <w:bookmarkStart w:id="29" w:name="X7c84d73e9e1f36a43526e330d7e8504bbddae85"/>
-    <w:p>
-      <w:pPr>
-        <w:pStyle w:val="Heading3"/>
-      </w:pPr>
-      <w:r>
-        <w:t xml:space="preserve">5.3 Gantt</w:t>
-      </w:r>
-    </w:p>
-    <w:p>
-      <w:pPr>
-        <w:pStyle w:val="FirstParagraph"/>
-      </w:pPr>
-      <w:r>
-        <w:t xml:space="preserve">Grafico de barras temporal mostrando todos os periodos de ferias do ano.</w:t>
-      </w:r>
-      <w:r>
-        <w:t xml:space="preserve"> </w:t>
-      </w:r>
-      <w:r>
-        <w:t xml:space="preserve">Renderizado pelo Mermaid no proprio navegador.</w:t>
-      </w:r>
-    </w:p>
-    <w:bookmarkEnd w:id="29"/>
-    <w:bookmarkStart w:id="30" w:name="X0d275198b05a20fc879262cd30125a57cf53e08"/>
-    <w:p>
-      <w:pPr>
-        <w:pStyle w:val="Heading3"/>
-      </w:pPr>
-      <w:r>
-        <w:t xml:space="preserve">5.4 Rodape de autoria</w:t>
-      </w:r>
-    </w:p>
-    <w:p>
-      <w:pPr>
-        <w:pStyle w:val="FirstParagraph"/>
-      </w:pPr>
-      <w:r>
-        <w:t xml:space="preserve">Linha final no formato:</w:t>
-      </w:r>
-    </w:p>
-    <w:p>
-      <w:pPr>
-        <w:pStyle w:val="BlockText"/>
-      </w:pPr>
+        <w:t xml:space="preserve">O texto muda para</w:t>
+      </w:r>
+      <w:r>
+        <w:t xml:space="preserve"> </w:t>
+      </w:r>
       <w:r>
         <w:rPr>
           <w:i/>
           <w:iCs/>
         </w:rPr>
-        <w:t xml:space="preserve">Criado e compilado por</w:t>
-      </w:r>
-      <w:r>
-        <w:rPr>
-          <w:i/>
-          <w:iCs/>
-        </w:rPr>
-        <w:t xml:space="preserve"> </w:t>
-      </w:r>
-      <w:r>
-        <w:rPr>
-          <w:b/>
-          <w:bCs/>
-          <w:i/>
-          <w:iCs/>
-        </w:rPr>
-        <w:t xml:space="preserve">Carlos Seidl</w:t>
-      </w:r>
-      <w:r>
-        <w:rPr>
-          <w:i/>
-          <w:iCs/>
-        </w:rPr>
-        <w:t xml:space="preserve"> </w:t>
-      </w:r>
-      <w:r>
-        <w:rPr>
-          <w:i/>
-          <w:iCs/>
-        </w:rPr>
-        <w:t xml:space="preserve">em 25/04/2026 as 14:30.</w:t>
-      </w:r>
-    </w:p>
-    <w:p>
-      <w:r>
-        <w:pict>
-          <v:rect style="width:0;height:1.5pt" o:hralign="center" o:hrstd="t" o:hr="t"/>
-        </w:pict>
-      </w:r>
-    </w:p>
-    <w:bookmarkEnd w:id="30"/>
-    <w:bookmarkEnd w:id="31"/>
-    <w:bookmarkStart w:id="33" w:name="X861f35370f25a6e0a6132c806d0d33d128143c2"/>
-    <w:p>
-      <w:pPr>
-        <w:pStyle w:val="Heading2"/>
-      </w:pPr>
-      <w:r>
-        <w:t xml:space="preserve">6. Problemas comuns</w:t>
+        <w:t xml:space="preserve">"Gerando relatorio... Aguarde..."</w:t>
+      </w:r>
+    </w:p>
+    <w:p>
+      <w:pPr>
+        <w:pStyle w:val="FirstParagraph"/>
+      </w:pPr>
+      <w:r>
+        <w:t xml:space="preserve">Tempo estimado:</w:t>
       </w:r>
     </w:p>
     <w:tbl>
@@ -1838,6 +1379,1002 @@
               <w:pStyle w:val="Compact"/>
             </w:pPr>
             <w:r>
+              <w:t xml:space="preserve">Cenario</w:t>
+            </w:r>
+          </w:p>
+        </w:tc>
+        <w:tc>
+          <w:tcPr/>
+          <w:p>
+            <w:pPr>
+              <w:pStyle w:val="Compact"/>
+            </w:pPr>
+            <w:r>
+              <w:t xml:space="preserve">Tempo aproximado</w:t>
+            </w:r>
+          </w:p>
+        </w:tc>
+      </w:tr>
+      <w:tr>
+        <w:tc>
+          <w:tcPr/>
+          <w:p>
+            <w:pPr>
+              <w:pStyle w:val="Compact"/>
+            </w:pPr>
+            <w:r>
+              <w:t xml:space="preserve">HTML somente, planilha pequena</w:t>
+            </w:r>
+          </w:p>
+        </w:tc>
+        <w:tc>
+          <w:tcPr/>
+          <w:p>
+            <w:pPr>
+              <w:pStyle w:val="Compact"/>
+            </w:pPr>
+            <w:r>
+              <w:t xml:space="preserve">5 segundos</w:t>
+            </w:r>
+          </w:p>
+        </w:tc>
+      </w:tr>
+      <w:tr>
+        <w:tc>
+          <w:tcPr/>
+          <w:p>
+            <w:pPr>
+              <w:pStyle w:val="Compact"/>
+            </w:pPr>
+            <w:r>
+              <w:t xml:space="preserve">HTML + PDF, planilha pequena</w:t>
+            </w:r>
+          </w:p>
+        </w:tc>
+        <w:tc>
+          <w:tcPr/>
+          <w:p>
+            <w:pPr>
+              <w:pStyle w:val="Compact"/>
+            </w:pPr>
+            <w:r>
+              <w:t xml:space="preserve">15 segundos</w:t>
+            </w:r>
+          </w:p>
+        </w:tc>
+      </w:tr>
+      <w:tr>
+        <w:tc>
+          <w:tcPr/>
+          <w:p>
+            <w:pPr>
+              <w:pStyle w:val="Compact"/>
+            </w:pPr>
+            <w:r>
+              <w:t xml:space="preserve">Primeira execucao (instala Pandoc)</w:t>
+            </w:r>
+          </w:p>
+        </w:tc>
+        <w:tc>
+          <w:tcPr/>
+          <w:p>
+            <w:pPr>
+              <w:pStyle w:val="Compact"/>
+            </w:pPr>
+            <w:r>
+              <w:t xml:space="preserve">ate 2 minutos</w:t>
+            </w:r>
+          </w:p>
+        </w:tc>
+      </w:tr>
+    </w:tbl>
+    <w:p>
+      <w:pPr>
+        <w:pStyle w:val="BlockText"/>
+      </w:pPr>
+      <w:r>
+        <w:t xml:space="preserve">Atalhos:</w:t>
+      </w:r>
+      <w:r>
+        <w:t xml:space="preserve"> </w:t>
+      </w:r>
+      <w:r>
+        <w:rPr>
+          <w:b/>
+          <w:bCs/>
+        </w:rPr>
+        <w:t xml:space="preserve">Enter</w:t>
+      </w:r>
+      <w:r>
+        <w:t xml:space="preserve"> </w:t>
+      </w:r>
+      <w:r>
+        <w:t xml:space="preserve">= Gerar,</w:t>
+      </w:r>
+      <w:r>
+        <w:t xml:space="preserve"> </w:t>
+      </w:r>
+      <w:r>
+        <w:rPr>
+          <w:b/>
+          <w:bCs/>
+        </w:rPr>
+        <w:t xml:space="preserve">Esc</w:t>
+      </w:r>
+      <w:r>
+        <w:t xml:space="preserve"> </w:t>
+      </w:r>
+      <w:r>
+        <w:t xml:space="preserve">= Fechar.</w:t>
+      </w:r>
+    </w:p>
+    <w:bookmarkEnd w:id="23"/>
+    <w:bookmarkStart w:id="24" w:name="Xc95bed303459c01c5f00602b179f4884850da0c"/>
+    <w:p>
+      <w:pPr>
+        <w:pStyle w:val="Heading3"/>
+      </w:pPr>
+      <w:r>
+        <w:t xml:space="preserve">3.4 Resultado</w:t>
+      </w:r>
+    </w:p>
+    <w:p>
+      <w:pPr>
+        <w:pStyle w:val="FirstParagraph"/>
+      </w:pPr>
+      <w:r>
+        <w:t xml:space="preserve">Quando termina:</w:t>
+      </w:r>
+    </w:p>
+    <w:p>
+      <w:pPr>
+        <w:pStyle w:val="Compact"/>
+        <w:numPr>
+          <w:ilvl w:val="0"/>
+          <w:numId w:val="1006"/>
+        </w:numPr>
+      </w:pPr>
+      <w:r>
+        <w:t xml:space="preserve">O texto fica verde:</w:t>
+      </w:r>
+      <w:r>
+        <w:t xml:space="preserve"> </w:t>
+      </w:r>
+      <w:r>
+        <w:rPr>
+          <w:i/>
+          <w:iCs/>
+        </w:rPr>
+        <w:t xml:space="preserve">"Sucesso! Arquivos gerados: ..."</w:t>
+      </w:r>
+    </w:p>
+    <w:p>
+      <w:pPr>
+        <w:pStyle w:val="Compact"/>
+        <w:numPr>
+          <w:ilvl w:val="0"/>
+          <w:numId w:val="1006"/>
+        </w:numPr>
+      </w:pPr>
+      <w:r>
+        <w:t xml:space="preserve">Se a checkbox</w:t>
+      </w:r>
+      <w:r>
+        <w:t xml:space="preserve"> </w:t>
+      </w:r>
+      <w:r>
+        <w:rPr>
+          <w:b/>
+          <w:bCs/>
+        </w:rPr>
+        <w:t xml:space="preserve">Abrir apos gerar</w:t>
+      </w:r>
+      <w:r>
+        <w:t xml:space="preserve"> </w:t>
+      </w:r>
+      <w:r>
+        <w:t xml:space="preserve">estava marcada, o arquivo abre</w:t>
+      </w:r>
+    </w:p>
+    <w:p>
+      <w:r>
+        <w:pict>
+          <v:rect style="width:0;height:1.5pt" o:hralign="center" o:hrstd="t" o:hr="t"/>
+        </w:pict>
+      </w:r>
+    </w:p>
+    <w:bookmarkEnd w:id="24"/>
+    <w:bookmarkEnd w:id="25"/>
+    <w:bookmarkStart w:id="26" w:name="X633c7a42b2fe74a3e3cea1265264fc10af5da22"/>
+    <w:p>
+      <w:pPr>
+        <w:pStyle w:val="Heading2"/>
+      </w:pPr>
+      <w:r>
+        <w:t xml:space="preserve">4. Onde estao os arquivos gerados</w:t>
+      </w:r>
+    </w:p>
+    <w:p>
+      <w:pPr>
+        <w:pStyle w:val="FirstParagraph"/>
+      </w:pPr>
+      <w:r>
+        <w:t xml:space="preserve">Cada execucao cria arquivos com timestamp na pasta</w:t>
+      </w:r>
+      <w:r>
+        <w:t xml:space="preserve"> </w:t>
+      </w:r>
+      <w:r>
+        <w:rPr>
+          <w:rStyle w:val="VerbatimChar"/>
+        </w:rPr>
+        <w:t xml:space="preserve">results\</w:t>
+      </w:r>
+      <w:r>
+        <w:t xml:space="preserve">:</w:t>
+      </w:r>
+    </w:p>
+    <w:p>
+      <w:pPr>
+        <w:pStyle w:val="SourceCode"/>
+      </w:pPr>
+      <w:r>
+        <w:rPr>
+          <w:rStyle w:val="VerbatimChar"/>
+        </w:rPr>
+        <w:t xml:space="preserve">results\</w:t>
+      </w:r>
+      <w:r>
+        <w:br/>
+      </w:r>
+      <w:r>
+        <w:rPr>
+          <w:rStyle w:val="VerbatimChar"/>
+        </w:rPr>
+        <w:t xml:space="preserve">  Ferias-20260425-143012.md     &lt;- versao Markdown (texto puro)</w:t>
+      </w:r>
+      <w:r>
+        <w:br/>
+      </w:r>
+      <w:r>
+        <w:rPr>
+          <w:rStyle w:val="VerbatimChar"/>
+        </w:rPr>
+        <w:t xml:space="preserve">  Ferias-20260425-143012.html   &lt;- versao HTML formatada (interativa)</w:t>
+      </w:r>
+      <w:r>
+        <w:br/>
+      </w:r>
+      <w:r>
+        <w:rPr>
+          <w:rStyle w:val="VerbatimChar"/>
+        </w:rPr>
+        <w:t xml:space="preserve">  Ferias-20260425-143012.pdf    &lt;- versao PDF (so se "Gerar PDF" marcado)</w:t>
+      </w:r>
+    </w:p>
+    <w:p>
+      <w:pPr>
+        <w:pStyle w:val="Compact"/>
+        <w:numPr>
+          <w:ilvl w:val="0"/>
+          <w:numId w:val="1007"/>
+        </w:numPr>
+      </w:pPr>
+      <w:r>
+        <w:t xml:space="preserve">O</w:t>
+      </w:r>
+      <w:r>
+        <w:t xml:space="preserve"> </w:t>
+      </w:r>
+      <w:r>
+        <w:rPr>
+          <w:b/>
+          <w:bCs/>
+        </w:rPr>
+        <w:t xml:space="preserve">HTML</w:t>
+      </w:r>
+      <w:r>
+        <w:t xml:space="preserve"> </w:t>
+      </w:r>
+      <w:r>
+        <w:t xml:space="preserve">abre em qualquer navegador. CSS e Mermaid embutidos no proprio</w:t>
+      </w:r>
+      <w:r>
+        <w:t xml:space="preserve"> </w:t>
+      </w:r>
+      <w:r>
+        <w:t xml:space="preserve">arquivo - funciona offline.</w:t>
+      </w:r>
+    </w:p>
+    <w:p>
+      <w:pPr>
+        <w:pStyle w:val="Compact"/>
+        <w:numPr>
+          <w:ilvl w:val="0"/>
+          <w:numId w:val="1007"/>
+        </w:numPr>
+      </w:pPr>
+      <w:r>
+        <w:t xml:space="preserve">O</w:t>
+      </w:r>
+      <w:r>
+        <w:t xml:space="preserve"> </w:t>
+      </w:r>
+      <w:r>
+        <w:rPr>
+          <w:b/>
+          <w:bCs/>
+        </w:rPr>
+        <w:t xml:space="preserve">PDF</w:t>
+      </w:r>
+      <w:r>
+        <w:t xml:space="preserve"> </w:t>
+      </w:r>
+      <w:r>
+        <w:t xml:space="preserve">e a versao para SharePoint, e-mail e impressao. Tambem totalmente</w:t>
+      </w:r>
+      <w:r>
+        <w:t xml:space="preserve"> </w:t>
+      </w:r>
+      <w:r>
+        <w:t xml:space="preserve">self-contained.</w:t>
+      </w:r>
+    </w:p>
+    <w:p>
+      <w:pPr>
+        <w:pStyle w:val="FirstParagraph"/>
+      </w:pPr>
+      <w:r>
+        <w:t xml:space="preserve">Como sao arquivos com timestamp,</w:t>
+      </w:r>
+      <w:r>
+        <w:t xml:space="preserve"> </w:t>
+      </w:r>
+      <w:r>
+        <w:rPr>
+          <w:b/>
+          <w:bCs/>
+        </w:rPr>
+        <w:t xml:space="preserve">nada e sobrescrito</w:t>
+      </w:r>
+      <w:r>
+        <w:t xml:space="preserve"> </w:t>
+      </w:r>
+      <w:r>
+        <w:t xml:space="preserve">- voce mantem o</w:t>
+      </w:r>
+      <w:r>
+        <w:t xml:space="preserve"> </w:t>
+      </w:r>
+      <w:r>
+        <w:t xml:space="preserve">historico de todas as versoes geradas.</w:t>
+      </w:r>
+    </w:p>
+    <w:p>
+      <w:r>
+        <w:pict>
+          <v:rect style="width:0;height:1.5pt" o:hralign="center" o:hrstd="t" o:hr="t"/>
+        </w:pict>
+      </w:r>
+    </w:p>
+    <w:bookmarkEnd w:id="26"/>
+    <w:bookmarkStart w:id="30" w:name="Xb14f28ca333cdc863aeb417f3dbed2c72df9019"/>
+    <w:p>
+      <w:pPr>
+        <w:pStyle w:val="Heading2"/>
+      </w:pPr>
+      <w:r>
+        <w:t xml:space="preserve">5. Publicacao no SharePoint</w:t>
+      </w:r>
+    </w:p>
+    <w:bookmarkStart w:id="27" w:name="X5cfb056939e26be859410eca06268f44fff55b9"/>
+    <w:p>
+      <w:pPr>
+        <w:pStyle w:val="Heading3"/>
+      </w:pPr>
+      <w:r>
+        <w:t xml:space="preserve">5.1 Por que PDF e nao HTML?</w:t>
+      </w:r>
+    </w:p>
+    <w:p>
+      <w:pPr>
+        <w:pStyle w:val="FirstParagraph"/>
+      </w:pPr>
+      <w:r>
+        <w:t xml:space="preserve">O SharePoint corporativo:</w:t>
+      </w:r>
+    </w:p>
+    <w:p>
+      <w:pPr>
+        <w:pStyle w:val="Compact"/>
+        <w:numPr>
+          <w:ilvl w:val="0"/>
+          <w:numId w:val="1008"/>
+        </w:numPr>
+      </w:pPr>
+      <w:r>
+        <w:rPr>
+          <w:b/>
+          <w:bCs/>
+        </w:rPr>
+        <w:t xml:space="preserve">Forca download</w:t>
+      </w:r>
+      <w:r>
+        <w:t xml:space="preserve"> </w:t>
+      </w:r>
+      <w:r>
+        <w:t xml:space="preserve">de arquivos</w:t>
+      </w:r>
+      <w:r>
+        <w:t xml:space="preserve"> </w:t>
+      </w:r>
+      <w:r>
+        <w:rPr>
+          <w:rStyle w:val="VerbatimChar"/>
+        </w:rPr>
+        <w:t xml:space="preserve">.html</w:t>
+      </w:r>
+      <w:r>
+        <w:t xml:space="preserve"> </w:t>
+      </w:r>
+      <w:r>
+        <w:t xml:space="preserve">em muitos tenants (em vez de fazer</w:t>
+      </w:r>
+      <w:r>
+        <w:t xml:space="preserve"> </w:t>
+      </w:r>
+      <w:r>
+        <w:t xml:space="preserve">preview inline)</w:t>
+      </w:r>
+    </w:p>
+    <w:p>
+      <w:pPr>
+        <w:pStyle w:val="Compact"/>
+        <w:numPr>
+          <w:ilvl w:val="0"/>
+          <w:numId w:val="1008"/>
+        </w:numPr>
+      </w:pPr>
+      <w:r>
+        <w:t xml:space="preserve">Pode</w:t>
+      </w:r>
+      <w:r>
+        <w:t xml:space="preserve"> </w:t>
+      </w:r>
+      <w:r>
+        <w:rPr>
+          <w:b/>
+          <w:bCs/>
+        </w:rPr>
+        <w:t xml:space="preserve">bloquear scripts externos</w:t>
+      </w:r>
+      <w:r>
+        <w:t xml:space="preserve"> </w:t>
+      </w:r>
+      <w:r>
+        <w:t xml:space="preserve">por politicas de seguranca (CSP)</w:t>
+      </w:r>
+    </w:p>
+    <w:p>
+      <w:pPr>
+        <w:pStyle w:val="FirstParagraph"/>
+      </w:pPr>
+      <w:r>
+        <w:t xml:space="preserve">O</w:t>
+      </w:r>
+      <w:r>
+        <w:t xml:space="preserve"> </w:t>
+      </w:r>
+      <w:r>
+        <w:rPr>
+          <w:b/>
+          <w:bCs/>
+        </w:rPr>
+        <w:t xml:space="preserve">PDF</w:t>
+      </w:r>
+      <w:r>
+        <w:t xml:space="preserve"> </w:t>
+      </w:r>
+      <w:r>
+        <w:t xml:space="preserve">evita esses dois problemas:</w:t>
+      </w:r>
+    </w:p>
+    <w:p>
+      <w:pPr>
+        <w:pStyle w:val="Compact"/>
+        <w:numPr>
+          <w:ilvl w:val="0"/>
+          <w:numId w:val="1009"/>
+        </w:numPr>
+      </w:pPr>
+      <w:r>
+        <w:t xml:space="preserve">O SharePoint sempre faz</w:t>
+      </w:r>
+      <w:r>
+        <w:t xml:space="preserve"> </w:t>
+      </w:r>
+      <w:r>
+        <w:rPr>
+          <w:b/>
+          <w:bCs/>
+        </w:rPr>
+        <w:t xml:space="preserve">preview nativo</w:t>
+      </w:r>
+      <w:r>
+        <w:t xml:space="preserve"> </w:t>
+      </w:r>
+      <w:r>
+        <w:t xml:space="preserve">de PDF na biblioteca de</w:t>
+      </w:r>
+      <w:r>
+        <w:t xml:space="preserve"> </w:t>
+      </w:r>
+      <w:r>
+        <w:t xml:space="preserve">documentos - usuarios visualizam direto sem baixar</w:t>
+      </w:r>
+    </w:p>
+    <w:p>
+      <w:pPr>
+        <w:pStyle w:val="Compact"/>
+        <w:numPr>
+          <w:ilvl w:val="0"/>
+          <w:numId w:val="1009"/>
+        </w:numPr>
+      </w:pPr>
+      <w:r>
+        <w:t xml:space="preserve">O PDF e gerado a partir do HTML usando o Microsoft Edge em modo</w:t>
+      </w:r>
+      <w:r>
+        <w:t xml:space="preserve"> </w:t>
+      </w:r>
+      <w:r>
+        <w:t xml:space="preserve">invisivel, com o</w:t>
+      </w:r>
+      <w:r>
+        <w:t xml:space="preserve"> </w:t>
+      </w:r>
+      <w:r>
+        <w:rPr>
+          <w:b/>
+          <w:bCs/>
+        </w:rPr>
+        <w:t xml:space="preserve">Gantt ja renderizado dentro do PDF</w:t>
+      </w:r>
+      <w:r>
+        <w:t xml:space="preserve"> </w:t>
+      </w:r>
+      <w:r>
+        <w:t xml:space="preserve">(nao precisa</w:t>
+      </w:r>
+      <w:r>
+        <w:t xml:space="preserve"> </w:t>
+      </w:r>
+      <w:r>
+        <w:t xml:space="preserve">de conexao com nada externo na hora de visualizar)</w:t>
+      </w:r>
+    </w:p>
+    <w:bookmarkEnd w:id="27"/>
+    <w:bookmarkStart w:id="28" w:name="X414556083f14b00702eba7021ac92b58ca5688a"/>
+    <w:p>
+      <w:pPr>
+        <w:pStyle w:val="Heading3"/>
+      </w:pPr>
+      <w:r>
+        <w:t xml:space="preserve">5.2 Fluxo recomendado para SharePoint</w:t>
+      </w:r>
+    </w:p>
+    <w:p>
+      <w:pPr>
+        <w:pStyle w:val="Compact"/>
+        <w:numPr>
+          <w:ilvl w:val="0"/>
+          <w:numId w:val="1010"/>
+        </w:numPr>
+      </w:pPr>
+      <w:r>
+        <w:t xml:space="preserve">Marcar a checkbox</w:t>
+      </w:r>
+      <w:r>
+        <w:t xml:space="preserve"> </w:t>
+      </w:r>
+      <w:r>
+        <w:rPr>
+          <w:b/>
+          <w:bCs/>
+        </w:rPr>
+        <w:t xml:space="preserve">Gerar PDF tambem (para upload no SharePoint)</w:t>
+      </w:r>
+    </w:p>
+    <w:p>
+      <w:pPr>
+        <w:pStyle w:val="Compact"/>
+        <w:numPr>
+          <w:ilvl w:val="0"/>
+          <w:numId w:val="1010"/>
+        </w:numPr>
+      </w:pPr>
+      <w:r>
+        <w:t xml:space="preserve">Clicar em</w:t>
+      </w:r>
+      <w:r>
+        <w:t xml:space="preserve"> </w:t>
+      </w:r>
+      <w:r>
+        <w:rPr>
+          <w:b/>
+          <w:bCs/>
+        </w:rPr>
+        <w:t xml:space="preserve">Gerar Relatorio</w:t>
+      </w:r>
+    </w:p>
+    <w:p>
+      <w:pPr>
+        <w:pStyle w:val="Compact"/>
+        <w:numPr>
+          <w:ilvl w:val="0"/>
+          <w:numId w:val="1010"/>
+        </w:numPr>
+      </w:pPr>
+      <w:r>
+        <w:t xml:space="preserve">Abrir a pasta</w:t>
+      </w:r>
+      <w:r>
+        <w:t xml:space="preserve"> </w:t>
+      </w:r>
+      <w:r>
+        <w:rPr>
+          <w:rStyle w:val="VerbatimChar"/>
+        </w:rPr>
+        <w:t xml:space="preserve">results\</w:t>
+      </w:r>
+    </w:p>
+    <w:p>
+      <w:pPr>
+        <w:pStyle w:val="Compact"/>
+        <w:numPr>
+          <w:ilvl w:val="0"/>
+          <w:numId w:val="1010"/>
+        </w:numPr>
+      </w:pPr>
+      <w:r>
+        <w:t xml:space="preserve">Subir o arquivo</w:t>
+      </w:r>
+      <w:r>
+        <w:t xml:space="preserve"> </w:t>
+      </w:r>
+      <w:r>
+        <w:rPr>
+          <w:rStyle w:val="VerbatimChar"/>
+        </w:rPr>
+        <w:t xml:space="preserve">Ferias-{timestamp}.pdf</w:t>
+      </w:r>
+      <w:r>
+        <w:t xml:space="preserve"> </w:t>
+      </w:r>
+      <w:r>
+        <w:t xml:space="preserve">na biblioteca do SharePoint</w:t>
+      </w:r>
+    </w:p>
+    <w:p>
+      <w:pPr>
+        <w:pStyle w:val="Compact"/>
+        <w:numPr>
+          <w:ilvl w:val="0"/>
+          <w:numId w:val="1010"/>
+        </w:numPr>
+      </w:pPr>
+      <w:r>
+        <w:t xml:space="preserve">Pronto - todos do time conseguem visualizar diretamente no navegador</w:t>
+      </w:r>
+    </w:p>
+    <w:p>
+      <w:pPr>
+        <w:pStyle w:val="BlockText"/>
+      </w:pPr>
+      <w:r>
+        <w:rPr>
+          <w:b/>
+          <w:bCs/>
+        </w:rPr>
+        <w:t xml:space="preserve">Dica:</w:t>
+      </w:r>
+      <w:r>
+        <w:t xml:space="preserve"> </w:t>
+      </w:r>
+      <w:r>
+        <w:t xml:space="preserve">crie uma pasta no SharePoint chamada "Planejamento de Ferias"</w:t>
+      </w:r>
+      <w:r>
+        <w:t xml:space="preserve"> </w:t>
+      </w:r>
+      <w:r>
+        <w:t xml:space="preserve">e va subindo um PDF novo a cada atualizacao. O timestamp no nome do</w:t>
+      </w:r>
+      <w:r>
+        <w:t xml:space="preserve"> </w:t>
+      </w:r>
+      <w:r>
+        <w:t xml:space="preserve">arquivo mantem o historico.</w:t>
+      </w:r>
+    </w:p>
+    <w:bookmarkEnd w:id="28"/>
+    <w:bookmarkStart w:id="29" w:name="X9304b940a274744d887fe86518c9c69f8e16970"/>
+    <w:p>
+      <w:pPr>
+        <w:pStyle w:val="Heading3"/>
+      </w:pPr>
+      <w:r>
+        <w:t xml:space="preserve">5.3 Requisitos para gerar PDF</w:t>
+      </w:r>
+    </w:p>
+    <w:p>
+      <w:pPr>
+        <w:pStyle w:val="Compact"/>
+        <w:numPr>
+          <w:ilvl w:val="0"/>
+          <w:numId w:val="1011"/>
+        </w:numPr>
+      </w:pPr>
+      <w:r>
+        <w:rPr>
+          <w:b/>
+          <w:bCs/>
+        </w:rPr>
+        <w:t xml:space="preserve">Microsoft Edge</w:t>
+      </w:r>
+      <w:r>
+        <w:t xml:space="preserve"> </w:t>
+      </w:r>
+      <w:r>
+        <w:t xml:space="preserve">ou</w:t>
+      </w:r>
+      <w:r>
+        <w:t xml:space="preserve"> </w:t>
+      </w:r>
+      <w:r>
+        <w:rPr>
+          <w:b/>
+          <w:bCs/>
+        </w:rPr>
+        <w:t xml:space="preserve">Google Chrome</w:t>
+      </w:r>
+      <w:r>
+        <w:t xml:space="preserve"> </w:t>
+      </w:r>
+      <w:r>
+        <w:t xml:space="preserve">instalado (Edge ja vem em</w:t>
+      </w:r>
+      <w:r>
+        <w:t xml:space="preserve"> </w:t>
+      </w:r>
+      <w:r>
+        <w:t xml:space="preserve">todo Windows 10/11; nada para fazer)</w:t>
+      </w:r>
+    </w:p>
+    <w:p>
+      <w:pPr>
+        <w:pStyle w:val="Compact"/>
+        <w:numPr>
+          <w:ilvl w:val="0"/>
+          <w:numId w:val="1011"/>
+        </w:numPr>
+      </w:pPr>
+      <w:r>
+        <w:t xml:space="preserve">A primeira geracao de PDF pode demorar uns segundos a mais enquanto o</w:t>
+      </w:r>
+      <w:r>
+        <w:t xml:space="preserve"> </w:t>
+      </w:r>
+      <w:r>
+        <w:t xml:space="preserve">Edge abre em modo invisivel</w:t>
+      </w:r>
+    </w:p>
+    <w:p>
+      <w:r>
+        <w:pict>
+          <v:rect style="width:0;height:1.5pt" o:hralign="center" o:hrstd="t" o:hr="t"/>
+        </w:pict>
+      </w:r>
+    </w:p>
+    <w:bookmarkEnd w:id="29"/>
+    <w:bookmarkEnd w:id="30"/>
+    <w:bookmarkStart w:id="35" w:name="Xbb5e2a137da0d64d0421b0320e9e2fa6d35b4fc"/>
+    <w:p>
+      <w:pPr>
+        <w:pStyle w:val="Heading2"/>
+      </w:pPr>
+      <w:r>
+        <w:t xml:space="preserve">6. O que tem dentro do relatorio</w:t>
+      </w:r>
+    </w:p>
+    <w:p>
+      <w:pPr>
+        <w:pStyle w:val="FirstParagraph"/>
+      </w:pPr>
+      <w:r>
+        <w:t xml:space="preserve">O HTML e o PDF tem 4 secoes:</w:t>
+      </w:r>
+    </w:p>
+    <w:bookmarkStart w:id="31" w:name="X8fd5d666e78bca9f276523c45da6448c453b4b0"/>
+    <w:p>
+      <w:pPr>
+        <w:pStyle w:val="Heading3"/>
+      </w:pPr>
+      <w:r>
+        <w:t xml:space="preserve">6.1 Dashboard mensal</w:t>
+      </w:r>
+    </w:p>
+    <w:p>
+      <w:pPr>
+        <w:pStyle w:val="FirstParagraph"/>
+      </w:pPr>
+      <w:r>
+        <w:t xml:space="preserve">Tabela resumo: quantas pessoas estao em ferias por mes, em que squads,</w:t>
+      </w:r>
+      <w:r>
+        <w:t xml:space="preserve"> </w:t>
+      </w:r>
+      <w:r>
+        <w:t xml:space="preserve">e qual o status geral.</w:t>
+      </w:r>
+    </w:p>
+    <w:bookmarkEnd w:id="31"/>
+    <w:bookmarkStart w:id="32" w:name="X953a082e1457f29e817574ac0f887ce50d6c845"/>
+    <w:p>
+      <w:pPr>
+        <w:pStyle w:val="Heading3"/>
+      </w:pPr>
+      <w:r>
+        <w:t xml:space="preserve">6.2 Cronograma detalhado</w:t>
+      </w:r>
+    </w:p>
+    <w:p>
+      <w:pPr>
+        <w:pStyle w:val="FirstParagraph"/>
+      </w:pPr>
+      <w:r>
+        <w:t xml:space="preserve">Tabela com</w:t>
+      </w:r>
+      <w:r>
+        <w:t xml:space="preserve"> </w:t>
+      </w:r>
+      <w:r>
+        <w:rPr>
+          <w:b/>
+          <w:bCs/>
+        </w:rPr>
+        <w:t xml:space="preserve">uma linha por periodo de ferias</w:t>
+      </w:r>
+      <w:r>
+        <w:t xml:space="preserve"> </w:t>
+      </w:r>
+      <w:r>
+        <w:t xml:space="preserve">- quem, qual squad, datas,</w:t>
+      </w:r>
+      <w:r>
+        <w:t xml:space="preserve"> </w:t>
+      </w:r>
+      <w:r>
+        <w:t xml:space="preserve">quantidade de dias, status.</w:t>
+      </w:r>
+    </w:p>
+    <w:bookmarkEnd w:id="32"/>
+    <w:bookmarkStart w:id="33" w:name="X23bd228e9dac07d6c51f0a98fcc0c90f6f637e9"/>
+    <w:p>
+      <w:pPr>
+        <w:pStyle w:val="Heading3"/>
+      </w:pPr>
+      <w:r>
+        <w:t xml:space="preserve">6.3 Gantt</w:t>
+      </w:r>
+    </w:p>
+    <w:p>
+      <w:pPr>
+        <w:pStyle w:val="FirstParagraph"/>
+      </w:pPr>
+      <w:r>
+        <w:t xml:space="preserve">Grafico de barras temporal mostrando todos os periodos de ferias do ano.</w:t>
+      </w:r>
+    </w:p>
+    <w:bookmarkEnd w:id="33"/>
+    <w:bookmarkStart w:id="34" w:name="X217444b0d266eae77c524b6e132d2c8957d0cf7"/>
+    <w:p>
+      <w:pPr>
+        <w:pStyle w:val="Heading3"/>
+      </w:pPr>
+      <w:r>
+        <w:t xml:space="preserve">6.4 Rodape de autoria</w:t>
+      </w:r>
+    </w:p>
+    <w:p>
+      <w:pPr>
+        <w:pStyle w:val="FirstParagraph"/>
+      </w:pPr>
+      <w:r>
+        <w:t xml:space="preserve">Linha final no formato:</w:t>
+      </w:r>
+    </w:p>
+    <w:p>
+      <w:pPr>
+        <w:pStyle w:val="BlockText"/>
+      </w:pPr>
+      <w:r>
+        <w:rPr>
+          <w:i/>
+          <w:iCs/>
+        </w:rPr>
+        <w:t xml:space="preserve">Criado e compilado por</w:t>
+      </w:r>
+      <w:r>
+        <w:rPr>
+          <w:i/>
+          <w:iCs/>
+        </w:rPr>
+        <w:t xml:space="preserve"> </w:t>
+      </w:r>
+      <w:r>
+        <w:rPr>
+          <w:b/>
+          <w:bCs/>
+          <w:i/>
+          <w:iCs/>
+        </w:rPr>
+        <w:t xml:space="preserve">Carlos Seidl</w:t>
+      </w:r>
+      <w:r>
+        <w:rPr>
+          <w:i/>
+          <w:iCs/>
+        </w:rPr>
+        <w:t xml:space="preserve"> </w:t>
+      </w:r>
+      <w:r>
+        <w:rPr>
+          <w:i/>
+          <w:iCs/>
+        </w:rPr>
+        <w:t xml:space="preserve">em 25/04/2026 as 14:30.</w:t>
+      </w:r>
+    </w:p>
+    <w:p>
+      <w:r>
+        <w:pict>
+          <v:rect style="width:0;height:1.5pt" o:hralign="center" o:hrstd="t" o:hr="t"/>
+        </w:pict>
+      </w:r>
+    </w:p>
+    <w:bookmarkEnd w:id="34"/>
+    <w:bookmarkEnd w:id="35"/>
+    <w:bookmarkStart w:id="37" w:name="Xb9900c90797d9cc342f95e9cbbe3d37176ee684"/>
+    <w:p>
+      <w:pPr>
+        <w:pStyle w:val="Heading2"/>
+      </w:pPr>
+      <w:r>
+        <w:t xml:space="preserve">7. Problemas comuns</w:t>
+      </w:r>
+    </w:p>
+    <w:tbl>
+      <w:tblPr>
+        <w:tblStyle w:val="Table"/>
+        <w:tblW w:type="auto" w:w="0"/>
+        <w:tblLook w:firstRow="1" w:lastRow="0" w:firstColumn="0" w:lastColumn="0" w:noHBand="0" w:noVBand="0" w:val="0020"/>
+      </w:tblPr>
+      <w:tblGrid>
+        <w:gridCol w:w="3960"/>
+        <w:gridCol w:w="3960"/>
+      </w:tblGrid>
+      <w:tr>
+        <w:trPr>
+          <w:tblHeader w:val="on"/>
+        </w:trPr>
+        <w:tc>
+          <w:tcPr/>
+          <w:p>
+            <w:pPr>
+              <w:pStyle w:val="Compact"/>
+            </w:pPr>
+            <w:r>
               <w:t xml:space="preserve">Problema</w:t>
             </w:r>
           </w:p>
@@ -2017,7 +2554,7 @@
               <w:t xml:space="preserve"> </w:t>
             </w:r>
             <w:r>
-              <w:t xml:space="preserve">no HTML (</w:t>
+              <w:t xml:space="preserve">no HTML/PDF (</w:t>
             </w:r>
             <w:r>
               <w:rPr>
@@ -2075,30 +2612,46 @@
                 <w:b/>
                 <w:bCs/>
               </w:rPr>
-              <w:t xml:space="preserve">HTML sem o Gantt</w:t>
-            </w:r>
-          </w:p>
-        </w:tc>
-        <w:tc>
-          <w:tcPr/>
-          <w:p>
-            <w:pPr>
-              <w:pStyle w:val="Compact"/>
-            </w:pPr>
-            <w:r>
-              <w:t xml:space="preserve">O Gantt precisa de internet ao abrir o HTML (CDN do Mermaid). Se voce esta numa rede corporativa que bloqueia</w:t>
-            </w:r>
-            <w:r>
-              <w:t xml:space="preserve"> </w:t>
-            </w:r>
+              <w:t xml:space="preserve">PDF gerado mas sem o Gantt</w:t>
+            </w:r>
+          </w:p>
+        </w:tc>
+        <w:tc>
+          <w:tcPr/>
+          <w:p>
+            <w:pPr>
+              <w:pStyle w:val="Compact"/>
+            </w:pPr>
+            <w:r>
+              <w:t xml:space="preserve">Edge nao conseguiu carregar o Mermaid. Repetir a geracao - geralmente resolve.</w:t>
+            </w:r>
+          </w:p>
+        </w:tc>
+      </w:tr>
+      <w:tr>
+        <w:tc>
+          <w:tcPr/>
+          <w:p>
+            <w:pPr>
+              <w:pStyle w:val="Compact"/>
+            </w:pPr>
             <w:r>
               <w:rPr>
-                <w:rStyle w:val="VerbatimChar"/>
+                <w:b/>
+                <w:bCs/>
               </w:rPr>
-              <w:t xml:space="preserve">cdn.jsdelivr.net</w:t>
-            </w:r>
-            <w:r>
-              <w:t xml:space="preserve">, o grafico nao carrega - mas o resto do relatorio funciona.</w:t>
+              <w:t xml:space="preserve">"Microsoft Edge ou Google Chrome nao encontrado"</w:t>
+            </w:r>
+          </w:p>
+        </w:tc>
+        <w:tc>
+          <w:tcPr/>
+          <w:p>
+            <w:pPr>
+              <w:pStyle w:val="Compact"/>
+            </w:pPr>
+            <w:r>
+              <w:t xml:space="preserve">Edge esta sumido do PATH padrao. Reinstalar Edge ou marcar so HTML (sem PDF).</w:t>
             </w:r>
           </w:p>
         </w:tc>
@@ -2148,7 +2701,7 @@
               <w:t xml:space="preserve"> </w:t>
             </w:r>
             <w:r>
-              <w:t xml:space="preserve">- o Mermaid carrega no navegador, fora do proxy, e funciona normal ao abrir o HTML.</w:t>
+              <w:t xml:space="preserve">- o HTML e o PDF funcionam normalmente.</w:t>
             </w:r>
           </w:p>
         </w:tc>
@@ -2221,7 +2774,7 @@
             <w:r>
               <w:t xml:space="preserve"> </w:t>
             </w:r>
-            <w:hyperlink r:id="rId32">
+            <w:hyperlink r:id="rId36">
               <w:r>
                 <w:rPr>
                   <w:rStyle w:val="Hyperlink"/>
@@ -2243,14 +2796,14 @@
         </w:pict>
       </w:r>
     </w:p>
-    <w:bookmarkEnd w:id="33"/>
-    <w:bookmarkStart w:id="34" w:name="X54b2b0da5a5460afacd93390d60a6727616b9ef"/>
+    <w:bookmarkEnd w:id="37"/>
+    <w:bookmarkStart w:id="38" w:name="X3dd3ccbf776938a28e2e21ac9c5da873bcaec16"/>
     <w:p>
       <w:pPr>
         <w:pStyle w:val="Heading2"/>
       </w:pPr>
       <w:r>
-        <w:t xml:space="preserve">7. Trocar o nome do autor</w:t>
+        <w:t xml:space="preserve">8. Trocar o nome do autor</w:t>
       </w:r>
     </w:p>
     <w:p>
@@ -2274,13 +2827,13 @@
         <w:t xml:space="preserve"> </w:t>
       </w:r>
       <w:r>
-        <w:t xml:space="preserve">aparece em 2 lugares: rodape do HTML + label da janela.</w:t>
-      </w:r>
-      <w:r>
-        <w:t xml:space="preserve"> </w:t>
-      </w:r>
-      <w:r>
-        <w:t xml:space="preserve">Para trocar de pessoa:</w:t>
+        <w:t xml:space="preserve">aparece em 2 lugares: rodape do HTML/PDF + label</w:t>
+      </w:r>
+      <w:r>
+        <w:t xml:space="preserve"> </w:t>
+      </w:r>
+      <w:r>
+        <w:t xml:space="preserve">da janela. Para trocar de pessoa:</w:t>
       </w:r>
     </w:p>
     <w:p>
@@ -2288,7 +2841,7 @@
         <w:pStyle w:val="Compact"/>
         <w:numPr>
           <w:ilvl w:val="0"/>
-          <w:numId w:val="1007"/>
+          <w:numId w:val="1012"/>
         </w:numPr>
       </w:pPr>
       <w:r>
@@ -2315,7 +2868,7 @@
         <w:pStyle w:val="Compact"/>
         <w:numPr>
           <w:ilvl w:val="0"/>
-          <w:numId w:val="1007"/>
+          <w:numId w:val="1012"/>
         </w:numPr>
       </w:pPr>
       <w:r>
@@ -2362,7 +2915,7 @@
         <w:pStyle w:val="Compact"/>
         <w:numPr>
           <w:ilvl w:val="0"/>
-          <w:numId w:val="1008"/>
+          <w:numId w:val="1013"/>
         </w:numPr>
       </w:pPr>
       <w:r>
@@ -2374,7 +2927,7 @@
         <w:pStyle w:val="Compact"/>
         <w:numPr>
           <w:ilvl w:val="0"/>
-          <w:numId w:val="1008"/>
+          <w:numId w:val="1013"/>
         </w:numPr>
       </w:pPr>
       <w:r>
@@ -2388,14 +2941,14 @@
         </w:pict>
       </w:r>
     </w:p>
-    <w:bookmarkEnd w:id="34"/>
-    <w:bookmarkStart w:id="35" w:name="X1997aa0e7918dd875af31d798d246f1e00edd2f"/>
+    <w:bookmarkEnd w:id="38"/>
+    <w:bookmarkStart w:id="39" w:name="X069db2e9f62d2232f4badb56b71eb702ef310b4"/>
     <w:p>
       <w:pPr>
         <w:pStyle w:val="Heading2"/>
       </w:pPr>
       <w:r>
-        <w:t xml:space="preserve">8. Atualizar para uma versao nova</w:t>
+        <w:t xml:space="preserve">9. Atualizar para uma versao nova</w:t>
       </w:r>
     </w:p>
     <w:p>
@@ -2411,7 +2964,7 @@
         <w:pStyle w:val="Compact"/>
         <w:numPr>
           <w:ilvl w:val="0"/>
-          <w:numId w:val="1009"/>
+          <w:numId w:val="1014"/>
         </w:numPr>
       </w:pPr>
       <w:r>
@@ -2432,7 +2985,7 @@
         <w:pStyle w:val="Compact"/>
         <w:numPr>
           <w:ilvl w:val="0"/>
-          <w:numId w:val="1009"/>
+          <w:numId w:val="1014"/>
         </w:numPr>
       </w:pPr>
       <w:r>
@@ -2460,7 +3013,7 @@
         <w:pStyle w:val="Compact"/>
         <w:numPr>
           <w:ilvl w:val="0"/>
-          <w:numId w:val="1009"/>
+          <w:numId w:val="1014"/>
         </w:numPr>
       </w:pPr>
       <w:r>
@@ -2487,7 +3040,7 @@
         <w:pStyle w:val="Compact"/>
         <w:numPr>
           <w:ilvl w:val="0"/>
-          <w:numId w:val="1009"/>
+          <w:numId w:val="1014"/>
         </w:numPr>
       </w:pPr>
       <w:r>
@@ -2499,7 +3052,7 @@
         <w:pStyle w:val="Compact"/>
         <w:numPr>
           <w:ilvl w:val="0"/>
-          <w:numId w:val="1009"/>
+          <w:numId w:val="1014"/>
         </w:numPr>
       </w:pPr>
       <w:r>
@@ -2542,14 +3095,14 @@
         </w:pict>
       </w:r>
     </w:p>
-    <w:bookmarkEnd w:id="35"/>
-    <w:bookmarkStart w:id="37" w:name="X9daeb1d9756855bb5a936c3f9f0cf9db082a9c0"/>
+    <w:bookmarkEnd w:id="39"/>
+    <w:bookmarkStart w:id="41" w:name="Xedd35e1bbd3d417a92c1dd222a439e8f9b14edd"/>
     <w:p>
       <w:pPr>
         <w:pStyle w:val="Heading2"/>
       </w:pPr>
       <w:r>
-        <w:t xml:space="preserve">9. Suporte</w:t>
+        <w:t xml:space="preserve">10. Suporte</w:t>
       </w:r>
     </w:p>
     <w:p>
@@ -2565,7 +3118,7 @@
         <w:pStyle w:val="Compact"/>
         <w:numPr>
           <w:ilvl w:val="0"/>
-          <w:numId w:val="1010"/>
+          <w:numId w:val="1015"/>
         </w:numPr>
       </w:pPr>
       <w:r>
@@ -2574,7 +3127,7 @@
       <w:r>
         <w:t xml:space="preserve"> </w:t>
       </w:r>
-      <w:hyperlink r:id="rId36">
+      <w:hyperlink r:id="rId40">
         <w:r>
           <w:rPr>
             <w:rStyle w:val="Hyperlink"/>
@@ -2588,7 +3141,7 @@
         <w:pStyle w:val="Compact"/>
         <w:numPr>
           <w:ilvl w:val="0"/>
-          <w:numId w:val="1010"/>
+          <w:numId w:val="1015"/>
         </w:numPr>
       </w:pPr>
       <w:r>
@@ -2627,7 +3180,7 @@
           <w:i/>
           <w:iCs/>
         </w:rPr>
-        <w:t xml:space="preserve">Manual mantido junto do codigo em</w:t>
+        <w:t xml:space="preserve">Este manual e gerado a cada release a partir de</w:t>
       </w:r>
       <w:r>
         <w:rPr>
@@ -2649,25 +3202,75 @@
           <w:i/>
           <w:iCs/>
         </w:rPr>
-        <w:t xml:space="preserve">. A cada nova versao</w:t>
+        <w:t xml:space="preserve"> </w:t>
       </w:r>
       <w:r>
         <w:rPr>
           <w:i/>
           <w:iCs/>
         </w:rPr>
-        <w:t xml:space="preserve"> </w:t>
+        <w:t xml:space="preserve">(markdown</w:t>
       </w:r>
       <w:r>
         <w:rPr>
           <w:i/>
           <w:iCs/>
         </w:rPr>
-        <w:t xml:space="preserve">do app, o manual e atualizado e empacotado no ZIP.</w:t>
-      </w:r>
-    </w:p>
-    <w:bookmarkEnd w:id="37"/>
-    <w:bookmarkEnd w:id="38"/>
+        <w:t xml:space="preserve"> </w:t>
+      </w:r>
+      <w:r>
+        <w:rPr>
+          <w:i/>
+          <w:iCs/>
+        </w:rPr>
+        <w:t xml:space="preserve">fonte) e convertido para</w:t>
+      </w:r>
+      <w:r>
+        <w:rPr>
+          <w:i/>
+          <w:iCs/>
+        </w:rPr>
+        <w:t xml:space="preserve"> </w:t>
+      </w:r>
+      <w:r>
+        <w:rPr>
+          <w:rStyle w:val="VerbatimChar"/>
+          <w:i/>
+          <w:iCs/>
+        </w:rPr>
+        <w:t xml:space="preserve">MANUAL.docx</w:t>
+      </w:r>
+      <w:r>
+        <w:rPr>
+          <w:i/>
+          <w:iCs/>
+        </w:rPr>
+        <w:t xml:space="preserve"> </w:t>
+      </w:r>
+      <w:r>
+        <w:rPr>
+          <w:i/>
+          <w:iCs/>
+        </w:rPr>
+        <w:t xml:space="preserve">automaticamente. Edite o markdown</w:t>
+      </w:r>
+      <w:r>
+        <w:rPr>
+          <w:i/>
+          <w:iCs/>
+        </w:rPr>
+        <w:t xml:space="preserve"> </w:t>
+      </w:r>
+      <w:r>
+        <w:rPr>
+          <w:i/>
+          <w:iCs/>
+        </w:rPr>
+        <w:t xml:space="preserve">para atualizar.</w:t>
+      </w:r>
+    </w:p>
+    <w:bookmarkEnd w:id="41"/>
+    <w:bookmarkEnd w:id="42"/>
     <w:sectPr>
       <w:footnotePr>
         <w:numRestart w:val="eachSect"/>
@@ -3127,6 +3730,15 @@
     <w:abstractNumId w:val="991"/>
   </w:num>
   <w:num w:numId="1007">
+    <w:abstractNumId w:val="991"/>
+  </w:num>
+  <w:num w:numId="1008">
+    <w:abstractNumId w:val="991"/>
+  </w:num>
+  <w:num w:numId="1009">
+    <w:abstractNumId w:val="991"/>
+  </w:num>
+  <w:num w:numId="1010">
     <w:abstractNumId w:val="99411"/>
     <w:lvlOverride w:ilvl="0">
       <w:startOverride w:val="1"/>
@@ -3156,7 +3768,40 @@
       <w:startOverride w:val="1"/>
     </w:lvlOverride>
   </w:num>
-  <w:num w:numId="1008">
+  <w:num w:numId="1011">
+    <w:abstractNumId w:val="991"/>
+  </w:num>
+  <w:num w:numId="1012">
+    <w:abstractNumId w:val="99411"/>
+    <w:lvlOverride w:ilvl="0">
+      <w:startOverride w:val="1"/>
+    </w:lvlOverride>
+    <w:lvlOverride w:ilvl="1">
+      <w:startOverride w:val="1"/>
+    </w:lvlOverride>
+    <w:lvlOverride w:ilvl="2">
+      <w:startOverride w:val="1"/>
+    </w:lvlOverride>
+    <w:lvlOverride w:ilvl="3">
+      <w:startOverride w:val="1"/>
+    </w:lvlOverride>
+    <w:lvlOverride w:ilvl="4">
+      <w:startOverride w:val="1"/>
+    </w:lvlOverride>
+    <w:lvlOverride w:ilvl="5">
+      <w:startOverride w:val="1"/>
+    </w:lvlOverride>
+    <w:lvlOverride w:ilvl="6">
+      <w:startOverride w:val="1"/>
+    </w:lvlOverride>
+    <w:lvlOverride w:ilvl="7">
+      <w:startOverride w:val="1"/>
+    </w:lvlOverride>
+    <w:lvlOverride w:ilvl="8">
+      <w:startOverride w:val="1"/>
+    </w:lvlOverride>
+  </w:num>
+  <w:num w:numId="1013">
     <w:abstractNumId w:val="99413"/>
     <w:lvlOverride w:ilvl="0">
       <w:startOverride w:val="3"/>
@@ -3186,7 +3831,7 @@
       <w:startOverride w:val="3"/>
     </w:lvlOverride>
   </w:num>
-  <w:num w:numId="1009">
+  <w:num w:numId="1014">
     <w:abstractNumId w:val="99411"/>
     <w:lvlOverride w:ilvl="0">
       <w:startOverride w:val="1"/>
@@ -3216,7 +3861,7 @@
       <w:startOverride w:val="1"/>
     </w:lvlOverride>
   </w:num>
-  <w:num w:numId="1010">
+  <w:num w:numId="1015">
     <w:abstractNumId w:val="991"/>
   </w:num>
 </w:numbering>

</xml_diff>

<commit_message>
fix(gui): aumenta largura da janela para a mensagem de status caber
A mensagem de sucesso "Sucesso! Arquivos gerados: Ferias-{ts}.html,
Ferias-{ts}.pdf" estava sendo cortada no label de status quando o
PDF tambem era gerado.

- Form: 500x345 -> 580x365
- Label de status: largura 460 -> 540, altura 22 -> 36 (permite quebrar
  em 2 linhas se necessario)
- Demais controles realinhados para a nova largura
- Screenshot e MANUAL.docx regenerados
</commit_message>
<xml_diff>
--- a/docs/MANUAL.docx
+++ b/docs/MANUAL.docx
@@ -16,13 +16,13 @@
         <w:pStyle w:val="FirstParagraph"/>
       </w:pPr>
       <w:r>
-        <w:t xml:space="preserve">Este manual descreve o fluxo completo, do download ate gerar o relatorio.</w:t>
-      </w:r>
-      <w:r>
-        <w:t xml:space="preserve"> </w:t>
-      </w:r>
-      <w:r>
-        <w:t xml:space="preserve">Voce nao precisa saber programar para usar.</w:t>
+        <w:t xml:space="preserve">Este manual descreve o fluxo completo, do download ate gerar o</w:t>
+      </w:r>
+      <w:r>
+        <w:t xml:space="preserve"> </w:t>
+      </w:r>
+      <w:r>
+        <w:t xml:space="preserve">relatorio. Voce nao precisa saber programar para usar.</w:t>
       </w:r>
     </w:p>
     <w:p>
@@ -84,8 +84,6 @@
       <w:r>
         <w:rPr>
           <w:rStyle w:val="VerbatimChar"/>
-          <w:b/>
-          <w:bCs/>
         </w:rPr>
         <w:t xml:space="preserve">FeriasAutomacao-latest.zip</w:t>
       </w:r>
@@ -171,7 +169,21 @@
           <w:b/>
           <w:bCs/>
         </w:rPr>
-        <w:t xml:space="preserve">precisa extrair primeiro</w:t>
+        <w:t xml:space="preserve">precisa extrair</w:t>
+      </w:r>
+      <w:r>
+        <w:rPr>
+          <w:b/>
+          <w:bCs/>
+        </w:rPr>
+        <w:t xml:space="preserve"> </w:t>
+      </w:r>
+      <w:r>
+        <w:rPr>
+          <w:b/>
+          <w:bCs/>
+        </w:rPr>
+        <w:t xml:space="preserve">primeiro</w:t>
       </w:r>
     </w:p>
     <w:bookmarkEnd w:id="11"/>
@@ -315,13 +327,7 @@
         <w:t xml:space="preserve"> </w:t>
       </w:r>
       <w:r>
-        <w:t xml:space="preserve">automaticamente</w:t>
-      </w:r>
-      <w:r>
-        <w:t xml:space="preserve"> </w:t>
-      </w:r>
-      <w:r>
-        <w:t xml:space="preserve">(a partir de</w:t>
+        <w:t xml:space="preserve">automaticamente (a partir de</w:t>
       </w:r>
       <w:r>
         <w:t xml:space="preserve"> </w:t>
@@ -336,13 +342,19 @@
         <w:t xml:space="preserve"> </w:t>
       </w:r>
       <w:r>
-        <w:t xml:space="preserve">ou via winget). Pode demorar 1-2 minutos</w:t>
-      </w:r>
-      <w:r>
-        <w:t xml:space="preserve"> </w:t>
-      </w:r>
-      <w:r>
-        <w:t xml:space="preserve">da primeira vez. Nas execucoes seguintes, abre na hora.</w:t>
+        <w:t xml:space="preserve">ou via</w:t>
+      </w:r>
+      <w:r>
+        <w:t xml:space="preserve"> </w:t>
+      </w:r>
+      <w:r>
+        <w:t xml:space="preserve">winget). Pode demorar 1-2 minutos da primeira vez. Nas execucoes</w:t>
+      </w:r>
+      <w:r>
+        <w:t xml:space="preserve"> </w:t>
+      </w:r>
+      <w:r>
+        <w:t xml:space="preserve">seguintes, abre na hora.</w:t>
       </w:r>
     </w:p>
     <w:p>
@@ -408,8 +420,6 @@
       <w:r>
         <w:rPr>
           <w:rStyle w:val="VerbatimChar"/>
-          <w:b/>
-          <w:bCs/>
         </w:rPr>
         <w:t xml:space="preserve">Ferias</w:t>
       </w:r>
@@ -417,7 +427,13 @@
         <w:t xml:space="preserve"> </w:t>
       </w:r>
       <w:r>
-        <w:t xml:space="preserve">(e dela que o app le os dados).</w:t>
+        <w:t xml:space="preserve">(e dela que o app le os</w:t>
+      </w:r>
+      <w:r>
+        <w:t xml:space="preserve"> </w:t>
+      </w:r>
+      <w:r>
+        <w:t xml:space="preserve">dados).</w:t>
       </w:r>
     </w:p>
     <w:bookmarkEnd w:id="14"/>
@@ -960,7 +976,13 @@
         <w:t xml:space="preserve"> </w:t>
       </w:r>
       <w:r>
-        <w:t xml:space="preserve">de gerar o relatorio (Excel trava o arquivo)</w:t>
+        <w:t xml:space="preserve">de gerar o relatorio (Excel trava</w:t>
+      </w:r>
+      <w:r>
+        <w:t xml:space="preserve"> </w:t>
+      </w:r>
+      <w:r>
+        <w:t xml:space="preserve">o arquivo)</w:t>
       </w:r>
     </w:p>
     <w:p>
@@ -1003,8 +1025,6 @@
       <w:r>
         <w:rPr>
           <w:rStyle w:val="VerbatimChar"/>
-          <w:b/>
-          <w:bCs/>
         </w:rPr>
         <w:t xml:space="preserve">Gerar Relatorio.lnk</w:t>
       </w:r>
@@ -1030,7 +1050,7 @@
       <w:r>
         <w:drawing>
           <wp:inline>
-            <wp:extent cx="4812631" cy="3320715"/>
+            <wp:extent cx="5334000" cy="3356741"/>
             <wp:effectExtent b="0" l="0" r="0" t="0"/>
             <wp:docPr descr="Tela do gerador" title="" id="19" name="Picture"/>
             <a:graphic>
@@ -1051,7 +1071,7 @@
                   <pic:spPr bwMode="auto">
                     <a:xfrm>
                       <a:off x="0" y="0"/>
-                      <a:ext cx="4812631" cy="3320715"/>
+                      <a:ext cx="5334000" cy="3356741"/>
                     </a:xfrm>
                     <a:prstGeom prst="rect">
                       <a:avLst/>
@@ -1119,13 +1139,13 @@
         <w:t xml:space="preserve"> </w:t>
       </w:r>
       <w:r>
-        <w:t xml:space="preserve">- ano que aparece no titulo do relatorio e no Gantt.</w:t>
-      </w:r>
-      <w:r>
-        <w:t xml:space="preserve"> </w:t>
-      </w:r>
-      <w:r>
-        <w:t xml:space="preserve">Padrao = ano atual. Pode subir/descer com as setas ou digitar.</w:t>
+        <w:t xml:space="preserve">- ano que aparece no titulo do relatorio e no Gantt. Padrao</w:t>
+      </w:r>
+      <w:r>
+        <w:t xml:space="preserve"> </w:t>
+      </w:r>
+      <w:r>
+        <w:t xml:space="preserve">= ano atual. Pode subir/descer com as setas ou digitar.</w:t>
       </w:r>
     </w:p>
     <w:p>
@@ -1232,7 +1252,13 @@
         <w:t xml:space="preserve"> </w:t>
       </w:r>
       <w:r>
-        <w:t xml:space="preserve">estiver marcada, abre o PDF em vez do HTML.</w:t>
+        <w:t xml:space="preserve">estiver marcada, abre o PDF em vez do</w:t>
+      </w:r>
+      <w:r>
+        <w:t xml:space="preserve"> </w:t>
+      </w:r>
+      <w:r>
+        <w:t xml:space="preserve">HTML.</w:t>
       </w:r>
     </w:p>
     <w:p>
@@ -1677,13 +1703,13 @@
         <w:t xml:space="preserve"> </w:t>
       </w:r>
       <w:r>
-        <w:t xml:space="preserve">abre em qualquer navegador. CSS e Mermaid embutidos no proprio</w:t>
-      </w:r>
-      <w:r>
-        <w:t xml:space="preserve"> </w:t>
-      </w:r>
-      <w:r>
-        <w:t xml:space="preserve">arquivo - funciona offline.</w:t>
+        <w:t xml:space="preserve">abre em qualquer navegador. CSS e Mermaid embutidos no</w:t>
+      </w:r>
+      <w:r>
+        <w:t xml:space="preserve"> </w:t>
+      </w:r>
+      <w:r>
+        <w:t xml:space="preserve">proprio arquivo - funciona offline.</w:t>
       </w:r>
     </w:p>
     <w:p>
@@ -1711,13 +1737,13 @@
         <w:t xml:space="preserve"> </w:t>
       </w:r>
       <w:r>
-        <w:t xml:space="preserve">e a versao para SharePoint, e-mail e impressao. Tambem totalmente</w:t>
-      </w:r>
-      <w:r>
-        <w:t xml:space="preserve"> </w:t>
-      </w:r>
-      <w:r>
-        <w:t xml:space="preserve">self-contained.</w:t>
+        <w:t xml:space="preserve">e a versao para SharePoint, e-mail e impressao. Tambem</w:t>
+      </w:r>
+      <w:r>
+        <w:t xml:space="preserve"> </w:t>
+      </w:r>
+      <w:r>
+        <w:t xml:space="preserve">totalmente self-contained.</w:t>
       </w:r>
     </w:p>
     <w:p>
@@ -1818,13 +1844,13 @@
         <w:t xml:space="preserve"> </w:t>
       </w:r>
       <w:r>
-        <w:t xml:space="preserve">em muitos tenants (em vez de fazer</w:t>
-      </w:r>
-      <w:r>
-        <w:t xml:space="preserve"> </w:t>
-      </w:r>
-      <w:r>
-        <w:t xml:space="preserve">preview inline)</w:t>
+        <w:t xml:space="preserve">em muitos tenants (em vez de</w:t>
+      </w:r>
+      <w:r>
+        <w:t xml:space="preserve"> </w:t>
+      </w:r>
+      <w:r>
+        <w:t xml:space="preserve">fazer preview inline)</w:t>
       </w:r>
     </w:p>
     <w:p>
@@ -2082,19 +2108,19 @@
         <w:t xml:space="preserve"> </w:t>
       </w:r>
       <w:r>
-        <w:t xml:space="preserve">crie uma pasta no SharePoint chamada "Planejamento de Ferias"</w:t>
-      </w:r>
-      <w:r>
-        <w:t xml:space="preserve"> </w:t>
-      </w:r>
-      <w:r>
-        <w:t xml:space="preserve">e va subindo um PDF novo a cada atualizacao. O timestamp no nome do</w:t>
-      </w:r>
-      <w:r>
-        <w:t xml:space="preserve"> </w:t>
-      </w:r>
-      <w:r>
-        <w:t xml:space="preserve">arquivo mantem o historico.</w:t>
+        <w:t xml:space="preserve">crie uma pasta no SharePoint chamada "Planejamento de</w:t>
+      </w:r>
+      <w:r>
+        <w:t xml:space="preserve"> </w:t>
+      </w:r>
+      <w:r>
+        <w:t xml:space="preserve">Ferias" e va subindo um PDF novo a cada atualizacao. O timestamp no</w:t>
+      </w:r>
+      <w:r>
+        <w:t xml:space="preserve"> </w:t>
+      </w:r>
+      <w:r>
+        <w:t xml:space="preserve">nome do arquivo mantem o historico.</w:t>
       </w:r>
     </w:p>
     <w:bookmarkEnd w:id="28"/>
@@ -2142,13 +2168,13 @@
         <w:t xml:space="preserve"> </w:t>
       </w:r>
       <w:r>
-        <w:t xml:space="preserve">instalado (Edge ja vem em</w:t>
-      </w:r>
-      <w:r>
-        <w:t xml:space="preserve"> </w:t>
-      </w:r>
-      <w:r>
-        <w:t xml:space="preserve">todo Windows 10/11; nada para fazer)</w:t>
+        <w:t xml:space="preserve">instalado (Edge ja vem em todo</w:t>
+      </w:r>
+      <w:r>
+        <w:t xml:space="preserve"> </w:t>
+      </w:r>
+      <w:r>
+        <w:t xml:space="preserve">Windows 10/11; nada para fazer)</w:t>
       </w:r>
     </w:p>
     <w:p>
@@ -2209,13 +2235,13 @@
         <w:pStyle w:val="FirstParagraph"/>
       </w:pPr>
       <w:r>
-        <w:t xml:space="preserve">Tabela resumo: quantas pessoas estao em ferias por mes, em que squads,</w:t>
-      </w:r>
-      <w:r>
-        <w:t xml:space="preserve"> </w:t>
-      </w:r>
-      <w:r>
-        <w:t xml:space="preserve">e qual o status geral.</w:t>
+        <w:t xml:space="preserve">Tabela resumo: quantas pessoas estao em ferias por mes, em que squads, e</w:t>
+      </w:r>
+      <w:r>
+        <w:t xml:space="preserve"> </w:t>
+      </w:r>
+      <w:r>
+        <w:t xml:space="preserve">qual o status geral.</w:t>
       </w:r>
     </w:p>
     <w:bookmarkEnd w:id="31"/>
@@ -2249,13 +2275,13 @@
         <w:t xml:space="preserve"> </w:t>
       </w:r>
       <w:r>
-        <w:t xml:space="preserve">- quem, qual squad, datas,</w:t>
-      </w:r>
-      <w:r>
-        <w:t xml:space="preserve"> </w:t>
-      </w:r>
-      <w:r>
-        <w:t xml:space="preserve">quantidade de dias, status.</w:t>
+        <w:t xml:space="preserve">- quem, qual squad,</w:t>
+      </w:r>
+      <w:r>
+        <w:t xml:space="preserve"> </w:t>
+      </w:r>
+      <w:r>
+        <w:t xml:space="preserve">datas, quantidade de dias, status.</w:t>
       </w:r>
     </w:p>
     <w:bookmarkEnd w:id="32"/>
@@ -2827,13 +2853,13 @@
         <w:t xml:space="preserve"> </w:t>
       </w:r>
       <w:r>
-        <w:t xml:space="preserve">aparece em 2 lugares: rodape do HTML/PDF + label</w:t>
-      </w:r>
-      <w:r>
-        <w:t xml:space="preserve"> </w:t>
-      </w:r>
-      <w:r>
-        <w:t xml:space="preserve">da janela. Para trocar de pessoa:</w:t>
+        <w:t xml:space="preserve">aparece em 2 lugares: rodape do HTML/PDF +</w:t>
+      </w:r>
+      <w:r>
+        <w:t xml:space="preserve"> </w:t>
+      </w:r>
+      <w:r>
+        <w:t xml:space="preserve">label da janela. Para trocar de pessoa:</w:t>
       </w:r>
     </w:p>
     <w:p>
@@ -2881,33 +2907,9 @@
       </w:pPr>
       <w:r>
         <w:rPr>
-          <w:rStyle w:val="VariableTok"/>
-        </w:rPr>
-        <w:t xml:space="preserve">$AUTOR_FIXO</w:t>
-      </w:r>
-      <w:r>
-        <w:rPr>
-          <w:rStyle w:val="NormalTok"/>
-        </w:rPr>
-        <w:t xml:space="preserve"> </w:t>
-      </w:r>
-      <w:r>
-        <w:rPr>
-          <w:rStyle w:val="OperatorTok"/>
-        </w:rPr>
-        <w:t xml:space="preserve">=</w:t>
-      </w:r>
-      <w:r>
-        <w:rPr>
-          <w:rStyle w:val="NormalTok"/>
-        </w:rPr>
-        <w:t xml:space="preserve"> </w:t>
-      </w:r>
-      <w:r>
-        <w:rPr>
-          <w:rStyle w:val="StringTok"/>
-        </w:rPr>
-        <w:t xml:space="preserve">'Carlos Seidl'</w:t>
+          <w:rStyle w:val="VerbatimChar"/>
+        </w:rPr>
+        <w:t xml:space="preserve">$AUTOR_FIXO = 'Carlos Seidl'</w:t>
       </w:r>
     </w:p>
     <w:p>
@@ -3079,13 +3081,13 @@
         <w:t xml:space="preserve"> </w:t>
       </w:r>
       <w:r>
-        <w:t xml:space="preserve">da versao antiga voce pode preservar se quiser manter</w:t>
-      </w:r>
-      <w:r>
-        <w:t xml:space="preserve"> </w:t>
-      </w:r>
-      <w:r>
-        <w:t xml:space="preserve">o historico de relatorios gerados.</w:t>
+        <w:t xml:space="preserve">da versao antiga voce pode preservar se quiser</w:t>
+      </w:r>
+      <w:r>
+        <w:t xml:space="preserve"> </w:t>
+      </w:r>
+      <w:r>
+        <w:t xml:space="preserve">manter o historico de relatorios gerados.</w:t>
       </w:r>
     </w:p>
     <w:p>
@@ -3183,19 +3185,42 @@
         <w:t xml:space="preserve">Este manual e gerado a cada release a partir de</w:t>
       </w:r>
       <w:r>
+        <w:t xml:space="preserve"> </w:t>
+      </w:r>
+      <w:r>
+        <w:rPr>
+          <w:rStyle w:val="VerbatimChar"/>
+        </w:rPr>
+        <w:t xml:space="preserve">docs/MANUAL.md</w:t>
+      </w:r>
+      <w:r>
+        <w:t xml:space="preserve"> </w:t>
+      </w:r>
+      <w:r>
         <w:rPr>
           <w:i/>
           <w:iCs/>
         </w:rPr>
+        <w:t xml:space="preserve">(markdown fonte) e convertido para</w:t>
+      </w:r>
+      <w:r>
         <w:t xml:space="preserve"> </w:t>
       </w:r>
       <w:r>
         <w:rPr>
           <w:rStyle w:val="VerbatimChar"/>
+        </w:rPr>
+        <w:t xml:space="preserve">MANUAL.docx</w:t>
+      </w:r>
+      <w:r>
+        <w:t xml:space="preserve"> </w:t>
+      </w:r>
+      <w:r>
+        <w:rPr>
           <w:i/>
           <w:iCs/>
         </w:rPr>
-        <w:t xml:space="preserve">docs/MANUAL.md</w:t>
+        <w:t xml:space="preserve">automaticamente.</w:t>
       </w:r>
       <w:r>
         <w:rPr>
@@ -3209,64 +3234,7 @@
           <w:i/>
           <w:iCs/>
         </w:rPr>
-        <w:t xml:space="preserve">(markdown</w:t>
-      </w:r>
-      <w:r>
-        <w:rPr>
-          <w:i/>
-          <w:iCs/>
-        </w:rPr>
-        <w:t xml:space="preserve"> </w:t>
-      </w:r>
-      <w:r>
-        <w:rPr>
-          <w:i/>
-          <w:iCs/>
-        </w:rPr>
-        <w:t xml:space="preserve">fonte) e convertido para</w:t>
-      </w:r>
-      <w:r>
-        <w:rPr>
-          <w:i/>
-          <w:iCs/>
-        </w:rPr>
-        <w:t xml:space="preserve"> </w:t>
-      </w:r>
-      <w:r>
-        <w:rPr>
-          <w:rStyle w:val="VerbatimChar"/>
-          <w:i/>
-          <w:iCs/>
-        </w:rPr>
-        <w:t xml:space="preserve">MANUAL.docx</w:t>
-      </w:r>
-      <w:r>
-        <w:rPr>
-          <w:i/>
-          <w:iCs/>
-        </w:rPr>
-        <w:t xml:space="preserve"> </w:t>
-      </w:r>
-      <w:r>
-        <w:rPr>
-          <w:i/>
-          <w:iCs/>
-        </w:rPr>
-        <w:t xml:space="preserve">automaticamente. Edite o markdown</w:t>
-      </w:r>
-      <w:r>
-        <w:rPr>
-          <w:i/>
-          <w:iCs/>
-        </w:rPr>
-        <w:t xml:space="preserve"> </w:t>
-      </w:r>
-      <w:r>
-        <w:rPr>
-          <w:i/>
-          <w:iCs/>
-        </w:rPr>
-        <w:t xml:space="preserve">para atualizar.</w:t>
+        <w:t xml:space="preserve">Edite o markdown para atualizar.</w:t>
       </w:r>
     </w:p>
     <w:bookmarkEnd w:id="41"/>

</xml_diff>

<commit_message>
docs(manual): atualiza para v1.0.0 (year picker + filtro por ano + screenshot)
  - Reescreve a descricao do controle "Ano" pra refletir o novo picker
    estilo calendario (4x3, decada navegavel) que substituiu o
    NumericUpDown.
  - Adiciona regra explicita em "2.3 Regras": o relatorio so traz ferias
    do ano selecionado no picker (filtro estrito), mesmo quando a
    planilha tem linhas de outros anos.
  - Substitui a screenshot embedada (rId18.png) pela versao gerada apos
    a mudanca de UI.
  - Corrige o rodape que ainda mencionava docs/MANUAL.md como fonte (a
    fonte virou o proprio .docx).
  - Adiciona docs/update-manual.py com o script idempotente que aplica
    essas mudancas, pra facilitar reaplicacao em manutencoes futuras.

Co-Authored-By: Claude Opus 4.7 <noreply@anthropic.com>
</commit_message>
<xml_diff>
--- a/docs/MANUAL.docx
+++ b/docs/MANUAL.docx
@@ -984,6 +984,29 @@
       <w:r>
         <w:t xml:space="preserve">o arquivo)</w:t>
       </w:r>
+    </w:p>
+    <w:p>
+      <w:pPr>
+        <w:pStyle w:val="Compact"/>
+        <w:numPr>
+          <w:ilvl w:val="0"/>
+          <w:numId w:val="1002"/>
+        </w:numPr>
+      </w:pPr>
+      <w:r>
+        <w:t xml:space="preserve">O relatorio so traz ferias do ano selecionado no picker. Mesmo que a planilha tenha linhas de outros anos, elas sao filtradas fora antes de gerar o relatorio.</w:t>
+      </w:r>
+      <w:r/>
+      <w:r>
+        <w:rPr>
+          <w:b/>
+          <w:bCs/>
+        </w:rPr>
+      </w:r>
+      <w:r/>
+      <w:r/>
+      <w:r/>
+      <w:r/>
     </w:p>
     <w:p>
       <w:r>
@@ -1133,20 +1156,12 @@
           <w:b/>
           <w:bCs/>
         </w:rPr>
-        <w:t xml:space="preserve">Ano</w:t>
-      </w:r>
-      <w:r>
-        <w:t xml:space="preserve"> </w:t>
-      </w:r>
-      <w:r>
-        <w:t xml:space="preserve">- ano que aparece no titulo do relatorio e no Gantt. Padrao</w:t>
-      </w:r>
-      <w:r>
-        <w:t xml:space="preserve"> </w:t>
-      </w:r>
-      <w:r>
-        <w:t xml:space="preserve">= ano atual. Pode subir/descer com as setas ou digitar.</w:t>
-      </w:r>
+        <w:t>Ano - ano que aparece no titulo do relatorio, no Gantt e que filtra a planilha. Padrao = ano atual. Clicar no botao "ANO ▾" abre um calendario 4x3 com 12 anos por pagina; usar as setas no topo do popup para navegar de decada em decada e clicar no ano desejado. O popup fecha sozinho ao escolher um ano, ao apertar Esc ou ao clicar fora dele.</w:t>
+      </w:r>
+      <w:r/>
+      <w:r/>
+      <w:r/>
+      <w:r/>
     </w:p>
     <w:p>
       <w:pPr>
@@ -3182,59 +3197,45 @@
           <w:i/>
           <w:iCs/>
         </w:rPr>
-        <w:t xml:space="preserve">Este manual e gerado a cada release a partir de</w:t>
-      </w:r>
-      <w:r>
-        <w:t xml:space="preserve"> </w:t>
-      </w:r>
+        <w:t>Este manual e mantido em docs/MANUAL.docx (fonte direta). Para atualizar, edite o .docx e rode docs/update-manual.py se precisar reaplicar mudancas em massa.</w:t>
+      </w:r>
+      <w:r/>
       <w:r>
         <w:rPr>
           <w:rStyle w:val="VerbatimChar"/>
         </w:rPr>
-        <w:t xml:space="preserve">docs/MANUAL.md</w:t>
-      </w:r>
-      <w:r>
-        <w:t xml:space="preserve"> </w:t>
-      </w:r>
+      </w:r>
+      <w:r/>
       <w:r>
         <w:rPr>
           <w:i/>
           <w:iCs/>
         </w:rPr>
-        <w:t xml:space="preserve">(markdown fonte) e convertido para</w:t>
-      </w:r>
-      <w:r>
-        <w:t xml:space="preserve"> </w:t>
-      </w:r>
+      </w:r>
+      <w:r/>
       <w:r>
         <w:rPr>
           <w:rStyle w:val="VerbatimChar"/>
         </w:rPr>
-        <w:t xml:space="preserve">MANUAL.docx</w:t>
-      </w:r>
-      <w:r>
-        <w:t xml:space="preserve"> </w:t>
-      </w:r>
+      </w:r>
+      <w:r/>
       <w:r>
         <w:rPr>
           <w:i/>
           <w:iCs/>
         </w:rPr>
-        <w:t xml:space="preserve">automaticamente.</w:t>
       </w:r>
       <w:r>
         <w:rPr>
           <w:i/>
           <w:iCs/>
         </w:rPr>
-        <w:t xml:space="preserve"> </w:t>
       </w:r>
       <w:r>
         <w:rPr>
           <w:i/>
           <w:iCs/>
         </w:rPr>
-        <w:t xml:space="preserve">Edite o markdown para atualizar.</w:t>
       </w:r>
     </w:p>
     <w:bookmarkEnd w:id="41"/>

</xml_diff>

<commit_message>
docs(manual): adiciona instrucoes de instalacao via MSI
- Reescreve 1.1 mencionando as DUAS opcoes de download (.msi recomendado
  + .zip portatil)
- Insere nova secao 1.2 "Instalar via MSI (recomendado)" descrevendo o
  fluxo do instalador, incluindo a tela de selecao de features (Aplicativo
  obrigatorio, Atalhos Menu Iniciar/Desktop recomendados, Enviar para
  opcional)
- Renumera 1.2 -> 1.3 (Alternativa: extrair o ZIP) e 1.3 -> 1.4
  (Conferir o conteudo) pra acomodar a nova secao
- update-manual.py agora e idempotente nesse trecho: rodar de novo nao
  duplica conteudo
</commit_message>
<xml_diff>
--- a/docs/MANUAL.docx
+++ b/docs/MANUAL.docx
@@ -76,23 +76,16 @@
         <w:pStyle w:val="FirstParagraph"/>
       </w:pPr>
       <w:r>
-        <w:t xml:space="preserve">Clicar em</w:t>
-      </w:r>
-      <w:r>
-        <w:t xml:space="preserve"> </w:t>
-      </w:r>
+        <w:t>Baixar uma das opcoes disponiveis na pagina (recomendado: FeriasAutomacao-1.0.0.msi para instalacao automatica; FeriasAutomacao-latest.zip para versao portatil sem instalar nada).</w:t>
+      </w:r>
+      <w:r/>
       <w:r>
         <w:rPr>
           <w:rStyle w:val="VerbatimChar"/>
         </w:rPr>
-        <w:t xml:space="preserve">FeriasAutomacao-latest.zip</w:t>
-      </w:r>
-      <w:r>
-        <w:t xml:space="preserve"> </w:t>
-      </w:r>
-      <w:r>
-        <w:t xml:space="preserve">para baixar.</w:t>
-      </w:r>
+      </w:r>
+      <w:r/>
+      <w:r/>
     </w:p>
     <w:bookmarkEnd w:id="10"/>
     <w:bookmarkStart w:id="11" w:name="X85f9f525bfc0a90c37dee924a9ac2199005ab79"/>
@@ -101,8 +94,18 @@
         <w:pStyle w:val="Heading3"/>
       </w:pPr>
       <w:r>
-        <w:t xml:space="preserve">1.2 Extrair o ZIP</w:t>
-      </w:r>
+        <w:t xml:space="preserve">1.2 Instalar via MSI (recomendado)</w:t>
+      </w:r>
+    </w:p>
+    <w:p>
+      <w:pPr>
+        <w:pStyle w:val="FirstParagraph"/>
+      </w:pPr>
+      <w:r>
+        <w:t xml:space="preserve">O .msi instala o app por usuario (nao precisa de admin) em %LocalAppData%\Programs\FeriasAutomacao e cria os atalhos no menu Iniciar e na area de trabalho automaticamente.</w:t>
+      </w:r>
+      <w:r/>
+      <w:r/>
     </w:p>
     <w:p>
       <w:pPr>
@@ -113,17 +116,14 @@
         </w:numPr>
       </w:pPr>
       <w:r>
-        <w:t xml:space="preserve">Clicar com botao direito no ZIP -&gt;</w:t>
-      </w:r>
-      <w:r>
-        <w:t xml:space="preserve"> </w:t>
-      </w:r>
+        <w:t xml:space="preserve">Dar duplo clique em FeriasAutomacao-1.0.0.msi.</w:t>
+      </w:r>
+      <w:r/>
       <w:r>
         <w:rPr>
           <w:b/>
           <w:bCs/>
         </w:rPr>
-        <w:t xml:space="preserve">Extrair tudo...</w:t>
       </w:r>
     </w:p>
     <w:p>
@@ -135,19 +135,14 @@
         </w:numPr>
       </w:pPr>
       <w:r>
-        <w:t xml:space="preserve">Escolher uma pasta fixa (sugestao:</w:t>
-      </w:r>
-      <w:r>
-        <w:t xml:space="preserve"> </w:t>
-      </w:r>
-      <w:r>
-        <w:rPr>
-          <w:rStyle w:val="VerbatimChar"/>
-        </w:rPr>
-        <w:t xml:space="preserve">Documentos\FeriasAutomacao</w:t>
-      </w:r>
-      <w:r>
-        <w:t xml:space="preserve">)</w:t>
+        <w:t xml:space="preserve">O instalador mostra uma tela de selecao de features tipo arvore. Por padrao tudo vem marcado:</w:t>
+      </w:r>
+      <w:r/>
+      <w:r>
+        <w:rPr>
+          <w:b/>
+          <w:bCs/>
+        </w:rPr>
       </w:r>
     </w:p>
     <w:p>
@@ -159,30 +154,189 @@
         </w:numPr>
       </w:pPr>
       <w:r>
-        <w:t xml:space="preserve">NAO usar o ZIP direto pelo Windows Explorer -</w:t>
-      </w:r>
-      <w:r>
-        <w:t xml:space="preserve"> </w:t>
-      </w:r>
+        <w:t xml:space="preserve">- Aplicativo Ferias Automacao (obrigatorio): copia a planilha, os scripts, o icone e o instalador offline do Pandoc.</w:t>
+      </w:r>
+      <w:r/>
       <w:r>
         <w:rPr>
           <w:b/>
           <w:bCs/>
         </w:rPr>
-        <w:t xml:space="preserve">precisa extrair</w:t>
-      </w:r>
+      </w:r>
+    </w:p>
+    <w:p>
+      <w:pPr>
+        <w:pStyle w:val="Compact"/>
+        <w:numPr>
+          <w:ilvl w:val="0"/>
+          <w:numId w:val="1001"/>
+        </w:numPr>
+      </w:pPr>
+      <w:r>
+        <w:t xml:space="preserve">- Atalhos no Menu Iniciar (recomendado): cria a pasta "Programas &gt; Ferias Automacao" com os atalhos Gerar Relatorio, Manual e Pasta de instalacao.</w:t>
+      </w:r>
+      <w:r/>
       <w:r>
         <w:rPr>
           <w:b/>
           <w:bCs/>
         </w:rPr>
-        <w:t xml:space="preserve"> </w:t>
-      </w:r>
+      </w:r>
+    </w:p>
+    <w:p>
+      <w:pPr>
+        <w:pStyle w:val="Compact"/>
+        <w:numPr>
+          <w:ilvl w:val="0"/>
+          <w:numId w:val="1001"/>
+        </w:numPr>
+      </w:pPr>
+      <w:r>
+        <w:t xml:space="preserve">- Atalho na Area de Trabalho (recomendado): cria o atalho "Gerar Relatorio" direto na area de trabalho.</w:t>
+      </w:r>
+      <w:r/>
       <w:r>
         <w:rPr>
           <w:b/>
           <w:bCs/>
         </w:rPr>
+      </w:r>
+    </w:p>
+    <w:p>
+      <w:pPr>
+        <w:pStyle w:val="Compact"/>
+        <w:numPr>
+          <w:ilvl w:val="0"/>
+          <w:numId w:val="1001"/>
+        </w:numPr>
+      </w:pPr>
+      <w:r>
+        <w:t xml:space="preserve">- Atalho em "Enviar para" (opcional, vem desmarcado): adiciona o app ao menu de clique-direito do Windows. Marcar so se quiser abrir uma planilha .xlsx direto pelo Enviar para.</w:t>
+      </w:r>
+      <w:r/>
+      <w:r>
+        <w:rPr>
+          <w:b/>
+          <w:bCs/>
+        </w:rPr>
+      </w:r>
+    </w:p>
+    <w:p>
+      <w:pPr>
+        <w:pStyle w:val="Compact"/>
+        <w:numPr>
+          <w:ilvl w:val="0"/>
+          <w:numId w:val="1001"/>
+        </w:numPr>
+      </w:pPr>
+      <w:r>
+        <w:t xml:space="preserve">Clicar em Avancar &gt; Instalar e aguardar. Ao terminar, abrir o atalho Gerar Relatorio (menu Iniciar ou desktop) e seguir para a secao 2.</w:t>
+      </w:r>
+      <w:r/>
+      <w:r>
+        <w:rPr>
+          <w:b/>
+          <w:bCs/>
+        </w:rPr>
+      </w:r>
+    </w:p>
+    <w:p>
+      <w:pPr>
+        <w:pStyle w:val="FirstParagraph"/>
+      </w:pPr>
+      <w:r>
+        <w:t xml:space="preserve">Quem usar o MSI pode pular as secoes 1.3 e 1.4 abaixo - elas sao so para quem prefere a versao portatil em ZIP.</w:t>
+      </w:r>
+      <w:r/>
+      <w:r/>
+    </w:p>
+    <w:p>
+      <w:pPr>
+        <w:pStyle w:val="Heading3"/>
+      </w:pPr>
+      <w:r>
+        <w:t>1.3 Alternativa: extrair o ZIP</w:t>
+      </w:r>
+    </w:p>
+    <w:p>
+      <w:pPr>
+        <w:pStyle w:val="Compact"/>
+        <w:numPr>
+          <w:ilvl w:val="0"/>
+          <w:numId w:val="1001"/>
+        </w:numPr>
+      </w:pPr>
+      <w:r>
+        <w:t xml:space="preserve">Clicar com botao direito no ZIP -&gt;</w:t>
+      </w:r>
+      <w:r>
+        <w:t xml:space="preserve"> </w:t>
+      </w:r>
+      <w:r>
+        <w:rPr>
+          <w:b/>
+          <w:bCs/>
+        </w:rPr>
+        <w:t xml:space="preserve">Extrair tudo...</w:t>
+      </w:r>
+    </w:p>
+    <w:p>
+      <w:pPr>
+        <w:pStyle w:val="Compact"/>
+        <w:numPr>
+          <w:ilvl w:val="0"/>
+          <w:numId w:val="1001"/>
+        </w:numPr>
+      </w:pPr>
+      <w:r>
+        <w:t xml:space="preserve">Escolher uma pasta fixa (sugestao:</w:t>
+      </w:r>
+      <w:r>
+        <w:t xml:space="preserve"> </w:t>
+      </w:r>
+      <w:r>
+        <w:rPr>
+          <w:rStyle w:val="VerbatimChar"/>
+        </w:rPr>
+        <w:t xml:space="preserve">Documentos\FeriasAutomacao</w:t>
+      </w:r>
+      <w:r>
+        <w:t xml:space="preserve">)</w:t>
+      </w:r>
+    </w:p>
+    <w:p>
+      <w:pPr>
+        <w:pStyle w:val="Compact"/>
+        <w:numPr>
+          <w:ilvl w:val="0"/>
+          <w:numId w:val="1001"/>
+        </w:numPr>
+      </w:pPr>
+      <w:r>
+        <w:t xml:space="preserve">NAO usar o ZIP direto pelo Windows Explorer -</w:t>
+      </w:r>
+      <w:r>
+        <w:t xml:space="preserve"> </w:t>
+      </w:r>
+      <w:r>
+        <w:rPr>
+          <w:b/>
+          <w:bCs/>
+        </w:rPr>
+        <w:t xml:space="preserve">precisa extrair</w:t>
+      </w:r>
+      <w:r>
+        <w:rPr>
+          <w:b/>
+          <w:bCs/>
+        </w:rPr>
+        <w:t xml:space="preserve"> </w:t>
+      </w:r>
+      <w:r>
+        <w:rPr>
+          <w:b/>
+          <w:bCs/>
+        </w:rPr>
         <w:t xml:space="preserve">primeiro</w:t>
       </w:r>
     </w:p>
@@ -193,7 +347,7 @@
         <w:pStyle w:val="Heading3"/>
       </w:pPr>
       <w:r>
-        <w:t xml:space="preserve">1.3 Conferir o conteudo</w:t>
+        <w:t>1.4 Conferir o conteudo</w:t>
       </w:r>
     </w:p>
     <w:p>
@@ -984,6 +1138,29 @@
       <w:r>
         <w:t xml:space="preserve">o arquivo)</w:t>
       </w:r>
+    </w:p>
+    <w:p>
+      <w:pPr>
+        <w:pStyle w:val="Compact"/>
+        <w:numPr>
+          <w:ilvl w:val="0"/>
+          <w:numId w:val="1002"/>
+        </w:numPr>
+      </w:pPr>
+      <w:r>
+        <w:t xml:space="preserve">O relatorio so traz ferias do ano selecionado no picker. Mesmo que a planilha tenha linhas de outros anos, elas sao filtradas fora antes de gerar o relatorio.</w:t>
+      </w:r>
+      <w:r/>
+      <w:r>
+        <w:rPr>
+          <w:b/>
+          <w:bCs/>
+        </w:rPr>
+      </w:r>
+      <w:r/>
+      <w:r/>
+      <w:r/>
+      <w:r/>
     </w:p>
     <w:p>
       <w:pPr>

</xml_diff>

<commit_message>
feat(saida): pasta unica configuravel com nomes fixos, sobrescreve a anterior
Reverte a regra do commit anterior (subpasta com timestamp). Agora os
arquivos saem sempre na mesma pasta com nomes fixos (Ferias.md /
Ferias.html / Ferias.xlsx / Ferias.pdf) e cada execucao sobrescreve a
anterior.

A GUI ganhou um campo "Pasta de saida" com FolderBrowserDialog. A
escolha do usuario fica persistida em HKCU:\Software\FeriasAutomacao\
OutputDir, entao a janela ja abre apontando pra ela na proxima execucao.

executar.ps1 passa a aceitar -OutputDir e copia a planilha-fonte pra
mesma pasta com nome Ferias.xlsx. README e MANUAL.docx atualizados.

Co-Authored-By: Claude Opus 4.7 <noreply@anthropic.com>
</commit_message>
<xml_diff>
--- a/docs/MANUAL.docx
+++ b/docs/MANUAL.docx
@@ -1127,6 +1127,29 @@
       <w:r>
         <w:t xml:space="preserve">o arquivo)</w:t>
       </w:r>
+    </w:p>
+    <w:p>
+      <w:pPr>
+        <w:pStyle w:val="Compact"/>
+        <w:numPr>
+          <w:ilvl w:val="0"/>
+          <w:numId w:val="1002"/>
+        </w:numPr>
+      </w:pPr>
+      <w:r>
+        <w:t xml:space="preserve">O relatorio so traz ferias do ano selecionado no picker. Mesmo que a planilha tenha linhas de outros anos, elas sao filtradas fora antes de gerar o relatorio.</w:t>
+      </w:r>
+      <w:r/>
+      <w:r>
+        <w:rPr>
+          <w:b/>
+          <w:bCs/>
+        </w:rPr>
+      </w:r>
+      <w:r/>
+      <w:r/>
+      <w:r/>
+      <w:r/>
     </w:p>
     <w:p>
       <w:pPr>
@@ -1400,6 +1423,25 @@
     </w:p>
     <w:p>
       <w:pPr>
+        <w:pStyle w:val="Compact"/>
+        <w:numPr>
+          <w:ilvl w:val="0"/>
+          <w:numId w:val="1001"/>
+        </w:numPr>
+      </w:pPr>
+      <w:r>
+        <w:t xml:space="preserve">Pasta de saida - pasta onde os arquivos serao gerados (padrao: results\). Clicar em Procurar... abre um seletor de pasta; a escolha fica salva em HKCU:\Software\FeriasAutomacao\OutputDir pra abrir ja preenchida na proxima execucao. Cada execucao sobrescreve os arquivos anteriores nessa pasta.</w:t>
+      </w:r>
+      <w:r/>
+      <w:r>
+        <w:rPr>
+          <w:b/>
+          <w:bCs/>
+        </w:rPr>
+      </w:r>
+    </w:p>
+    <w:p>
+      <w:pPr>
         <w:numPr>
           <w:ilvl w:val="0"/>
           <w:numId w:val="1003"/>
@@ -1875,7 +1917,7 @@
         <w:pStyle w:val="FirstParagraph"/>
       </w:pPr>
       <w:r>
-        <w:t>Cada execucao cria uma subpasta results\Ferias-{timestamp}\ com o relatorio em multiplos formatos + a planilha-fonte:</w:t>
+        <w:t>Os arquivos sao gerados na pasta de saida configurada na GUI (padrao: results\) e cada execucao sobrescreve a anterior. A escolha do usuario fica persistida pra proxima execucao:</w:t>
       </w:r>
       <w:r/>
       <w:r>
@@ -1893,21 +1935,15 @@
         <w:rPr>
           <w:rStyle w:val="VerbatimChar"/>
         </w:rPr>
-        <w:t>results\</w:t>
+        <w:t>&lt;pasta-de-saida&gt;\</w:t>
         <w:br/>
-        <w:t xml:space="preserve">  Ferias-20260425-143012\</w:t>
+        <w:t xml:space="preserve">  Ferias.md     &lt;- versao Markdown (texto puro)</w:t>
         <w:br/>
-        <w:t xml:space="preserve">    Ferias-20260425-143012.md     &lt;- versao Markdown (texto puro)</w:t>
+        <w:t xml:space="preserve">  Ferias.html   &lt;- versao HTML formatada (interativa)</w:t>
         <w:br/>
-        <w:t xml:space="preserve">    Ferias-20260425-143012.html   &lt;- versao HTML formatada (interativa)</w:t>
+        <w:t xml:space="preserve">  Ferias.xlsx   &lt;- copia da planilha que gerou o relatorio</w:t>
         <w:br/>
-        <w:t xml:space="preserve">    Ferias-20260425-143012.xlsx   &lt;- copia da planilha que gerou o relatorio</w:t>
-        <w:br/>
-        <w:t xml:space="preserve">    Ferias-20260425-143012.pdf    &lt;- (opcional, com a opcao "Gerar PDF tambem" marcada)</w:t>
-        <w:br/>
-        <w:t xml:space="preserve">  Ferias-20260425-150133\         &lt;- proxima execucao, em nova subpasta</w:t>
-        <w:br/>
-        <w:t xml:space="preserve">    ...</w:t>
+        <w:t xml:space="preserve">  Ferias.pdf    &lt;- (opcional, com a opcao "Gerar PDF tambem" marcada)</w:t>
       </w:r>
       <w:r/>
       <w:r>
@@ -2313,7 +2349,7 @@
         </w:numPr>
       </w:pPr>
       <w:r>
-        <w:t>Subir o arquivo Ferias-{timestamp}.pdf de dentro da subpasta Ferias-{timestamp}\ na biblioteca do SharePoint</w:t>
+        <w:t>Subir o arquivo Ferias.pdf da pasta de saida na biblioteca do SharePoint</w:t>
       </w:r>
       <w:r/>
       <w:r>

</xml_diff>

<commit_message>
release(v1.0.0.1): promove a v1.0.0.1 a release oficial
Mudancas neste commit:

installer/Product.wxs
- Version: 1.0.0 -> 1.0.0.1

installer/build.ps1
- Path do MSI gerado: FeriasAutomacao-1.0.0.msi -> FeriasAutomacao-1.0.0.1.msi
- Comentario do header atualizado.

gui.ps1
- Label de versao na splash screen: 'v1.0.0' -> 'v1.0.0.1'.

docs/update-manual.py + docs/update-manual-hotfix.py
- Atualizadas referencias hardcoded ao nome do MSI.
- Hotfix ganhou secao 8 que substitui o nome no MANUAL.docx existente
  (idempotente: rodar de novo nao duplica).

docs/MANUAL.docx
- Mencoes a "FeriasAutomacao-1.0.0.msi" trocadas pra "1.0.0.1.msi"
  via secao 8 do hotfix.

A v1.0.0.1 traz tudo da v1.0.0 final + a feature de Controle de
Vencimento de Ferias (CLT 12/24 meses) com sub-blocos CRITICO,
ATENCAO e Dados Incompletos.

Tag v1.0.0 (release antiga) preservada apontando pro commit anterior.
Tag v1.0.0.1 nova criada apontando pra este commit.
</commit_message>
<xml_diff>
--- a/docs/MANUAL.docx
+++ b/docs/MANUAL.docx
@@ -76,7 +76,7 @@
         <w:pStyle w:val="FirstParagraph"/>
       </w:pPr>
       <w:r>
-        <w:t>Baixar uma das opcoes disponiveis na pagina (recomendado: FeriasAutomacao-1.0.0.msi para instalacao automatica; FeriasAutomacao-latest.zip para versao portatil sem instalar nada).</w:t>
+        <w:t>Baixar uma das opcoes disponiveis na pagina (recomendado: FeriasAutomacao-1.0.0.1.msi para instalacao automatica; FeriasAutomacao-latest.zip para versao portatil sem instalar nada).</w:t>
       </w:r>
       <w:r/>
       <w:r>
@@ -116,7 +116,7 @@
         </w:numPr>
       </w:pPr>
       <w:r>
-        <w:t xml:space="preserve">Dar duplo clique em FeriasAutomacao-1.0.0.msi.</w:t>
+        <w:t>Dar duplo clique em FeriasAutomacao-1.0.0.1.msi.</w:t>
       </w:r>
       <w:r/>
       <w:r>
@@ -2585,7 +2585,7 @@
         </w:numPr>
       </w:pPr>
       <w:r>
-        <w:t xml:space="preserve">App parou de abrir / arquivo da pasta de instalacao foi deletado: rodar de novo o .msi do release (oferece "Repair") ou abrir um console e executar msiexec /f "FeriasAutomacao-1.0.0.msi" pra reinstalar os arquivos faltantes. Como ultima alternativa, desinstalar pelo Painel de Controle e reinstalar.</w:t>
+        <w:t>App parou de abrir / arquivo da pasta de instalacao foi deletado: rodar de novo o .msi do release (oferece "Repair") ou abrir um console e executar msiexec /f "FeriasAutomacao-1.0.0.1.msi" pra reinstalar os arquivos faltantes. Como ultima alternativa, desinstalar pelo Painel de Controle e reinstalar.</w:t>
       </w:r>
       <w:r/>
       <w:r>

</xml_diff>